<commit_message>
fix(course): improve report and presentation formatting
</commit_message>
<xml_diff>
--- a/labs/lab01/report/report.docx
+++ b/labs/lab01/report/report.docx
@@ -2,7 +2,7 @@
 <file path=word/document.xml><?xml version="1.0" encoding="utf-8"?>
 <w:document xmlns:w="http://schemas.openxmlformats.org/wordprocessingml/2006/main" xmlns:m="http://schemas.openxmlformats.org/officeDocument/2006/math" xmlns:r="http://schemas.openxmlformats.org/officeDocument/2006/relationships" xmlns:o="urn:schemas-microsoft-com:office:office" xmlns:v="urn:schemas-microsoft-com:vml" xmlns:w10="urn:schemas-microsoft-com:office:word" xmlns:a="http://schemas.openxmlformats.org/drawingml/2006/main" xmlns:pic="http://schemas.openxmlformats.org/drawingml/2006/picture" xmlns:wp="http://schemas.openxmlformats.org/drawingml/2006/wordprocessingDrawing">
   <w:body>
-    <w:bookmarkStart w:id="13" w:name="Xa0f9e00941c799308ce9bfc80984b612e63703f"/>
+    <w:bookmarkStart w:id="22" w:name="Xa0f9e00941c799308ce9bfc80984b612e63703f"/>
     <w:p>
       <w:pPr>
         <w:pStyle w:val="Heading1"/>
@@ -13,205 +13,382 @@
     </w:p>
     <w:p>
       <w:pPr>
-        <w:pStyle w:val="SourceCode"/>
-      </w:pPr>
+        <w:pStyle w:val="FirstParagraph"/>
+      </w:pPr>
+      <w:r>
+        <w:t xml:space="preserve">ОТЧЁТ</w:t>
+      </w:r>
+    </w:p>
+    <w:p>
+      <w:pPr>
+        <w:pStyle w:val="BodyText"/>
+      </w:pPr>
+      <w:r>
+        <w:t xml:space="preserve">по лабораторной работе №1</w:t>
+      </w:r>
+    </w:p>
+    <w:p>
+      <w:pPr>
+        <w:pStyle w:val="BodyText"/>
+      </w:pPr>
+      <w:r>
+        <w:t xml:space="preserve">«Подготовка стенда и первая дифференциальная модель»</w:t>
+      </w:r>
+    </w:p>
+    <w:p>
+      <w:pPr>
+        <w:pStyle w:val="BodyText"/>
+      </w:pPr>
+      <w:r>
+        <w:t xml:space="preserve">по дисциплине «Имитационное моделирование»</w:t>
+      </w:r>
+    </w:p>
+    <w:tbl>
+      <w:tblPr>
+        <w:tblStyle w:val="Table"/>
+        <w:tblW w:type="pct" w:w="5000"/>
+        <w:tblLayout w:type="fixed"/>
+        <w:tblLook w:firstRow="1" w:lastRow="0" w:firstColumn="0" w:lastColumn="0" w:noHBand="0" w:noVBand="0" w:val="0020"/>
+      </w:tblPr>
+      <w:tblGrid>
+        <w:gridCol w:w="3960"/>
+        <w:gridCol w:w="3960"/>
+      </w:tblGrid>
+      <w:tr>
+        <w:trPr>
+          <w:tblHeader w:val="on"/>
+        </w:trPr>
+        <w:tc>
+          <w:tcPr/>
+          <w:p>
+            <w:pPr>
+              <w:pStyle w:val="Compact"/>
+            </w:pPr>
+            <w:r>
+              <w:t xml:space="preserve">Параметр</w:t>
+            </w:r>
+          </w:p>
+        </w:tc>
+        <w:tc>
+          <w:tcPr/>
+          <w:p>
+            <w:pPr>
+              <w:pStyle w:val="Compact"/>
+            </w:pPr>
+            <w:r>
+              <w:t xml:space="preserve">Значение</w:t>
+            </w:r>
+          </w:p>
+        </w:tc>
+      </w:tr>
+      <w:tr>
+        <w:tc>
+          <w:tcPr/>
+          <w:p>
+            <w:pPr>
+              <w:pStyle w:val="Compact"/>
+            </w:pPr>
+            <w:r>
+              <w:t xml:space="preserve">Студент</w:t>
+            </w:r>
+          </w:p>
+        </w:tc>
+        <w:tc>
+          <w:tcPr/>
+          <w:p>
+            <w:pPr>
+              <w:pStyle w:val="Compact"/>
+            </w:pPr>
+            <w:r>
+              <w:t xml:space="preserve">Исаева Зарина Исмайилбековна</w:t>
+            </w:r>
+          </w:p>
+        </w:tc>
+      </w:tr>
+      <w:tr>
+        <w:tc>
+          <w:tcPr/>
+          <w:p>
+            <w:pPr>
+              <w:pStyle w:val="Compact"/>
+            </w:pPr>
+            <w:r>
+              <w:t xml:space="preserve">Группа</w:t>
+            </w:r>
+          </w:p>
+        </w:tc>
+        <w:tc>
+          <w:tcPr/>
+          <w:p>
+            <w:pPr>
+              <w:pStyle w:val="Compact"/>
+            </w:pPr>
+            <w:r>
+              <w:t xml:space="preserve">НКНбд–01–23</w:t>
+            </w:r>
+          </w:p>
+        </w:tc>
+      </w:tr>
+      <w:tr>
+        <w:tc>
+          <w:tcPr/>
+          <w:p>
+            <w:pPr>
+              <w:pStyle w:val="Compact"/>
+            </w:pPr>
+            <w:r>
+              <w:t xml:space="preserve">Преподаватель</w:t>
+            </w:r>
+          </w:p>
+        </w:tc>
+        <w:tc>
+          <w:tcPr/>
+          <w:p>
+            <w:pPr>
+              <w:pStyle w:val="Compact"/>
+            </w:pPr>
+            <w:r>
+              <w:t xml:space="preserve">Кулябов Дмитрий Сергеевич, преподаватель дисциплины</w:t>
+            </w:r>
+          </w:p>
+        </w:tc>
+      </w:tr>
+      <w:tr>
+        <w:tc>
+          <w:tcPr/>
+          <w:p>
+            <w:pPr>
+              <w:pStyle w:val="Compact"/>
+            </w:pPr>
+            <w:r>
+              <w:t xml:space="preserve">Организация</w:t>
+            </w:r>
+          </w:p>
+        </w:tc>
+        <w:tc>
+          <w:tcPr/>
+          <w:p>
+            <w:pPr>
+              <w:pStyle w:val="Compact"/>
+            </w:pPr>
+            <w:r>
+              <w:t xml:space="preserve">Российский университет дружбы народов имени Патриса Лумумбы</w:t>
+            </w:r>
+          </w:p>
+        </w:tc>
+      </w:tr>
+      <w:tr>
+        <w:tc>
+          <w:tcPr/>
+          <w:p>
+            <w:pPr>
+              <w:pStyle w:val="Compact"/>
+            </w:pPr>
+            <w:r>
+              <w:t xml:space="preserve">Год</w:t>
+            </w:r>
+          </w:p>
+        </w:tc>
+        <w:tc>
+          <w:tcPr/>
+          <w:p>
+            <w:pPr>
+              <w:pStyle w:val="Compact"/>
+            </w:pPr>
+            <w:r>
+              <w:t xml:space="preserve">2026</w:t>
+            </w:r>
+          </w:p>
+        </w:tc>
+      </w:tr>
+    </w:tbl>
+    <w:bookmarkStart w:id="9" w:name="цель-работы"/>
+    <w:p>
+      <w:pPr>
+        <w:pStyle w:val="Heading2"/>
+      </w:pPr>
+      <w:r>
+        <w:t xml:space="preserve">Цель работы</w:t>
+      </w:r>
+    </w:p>
+    <w:p>
+      <w:pPr>
+        <w:pStyle w:val="FirstParagraph"/>
+      </w:pPr>
+      <w:r>
+        <w:t xml:space="preserve">Освоить структуру проекта, литературный стиль исходников и базовую модель экспоненциального роста.</w:t>
+      </w:r>
+    </w:p>
+    <w:bookmarkEnd w:id="9"/>
+    <w:bookmarkStart w:id="10" w:name="теоретические-сведения"/>
+    <w:p>
+      <w:pPr>
+        <w:pStyle w:val="Heading2"/>
+      </w:pPr>
+      <w:r>
+        <w:t xml:space="preserve">Теоретические сведения</w:t>
+      </w:r>
+    </w:p>
+    <w:p>
+      <w:pPr>
+        <w:pStyle w:val="FirstParagraph"/>
+      </w:pPr>
+      <w:r>
+        <w:t xml:space="preserve">Работа опирается на классические модели и публикации по теме имитационного моделирования. Для лабораторной работы сохранён воспроизводимый подход: основной сценарий хранится в</w:t>
+      </w:r>
+      <w:r>
+        <w:t xml:space="preserve"> </w:t>
+      </w:r>
       <w:r>
         <w:rPr>
           <w:rStyle w:val="VerbatimChar"/>
         </w:rPr>
-        <w:t xml:space="preserve">    **Дисциплина:** Имитационное моделирование  </w:t>
-      </w:r>
-      <w:r>
-        <w:br/>
+        <w:t xml:space="preserve">qmd</w:t>
+      </w:r>
+      <w:r>
+        <w:t xml:space="preserve">, из него автоматически формируются чистый</w:t>
+      </w:r>
+      <w:r>
+        <w:t xml:space="preserve"> </w:t>
       </w:r>
       <w:r>
         <w:rPr>
           <w:rStyle w:val="VerbatimChar"/>
         </w:rPr>
-        <w:t xml:space="preserve">    **Студент:** Исаева Зарина Исмайилбековна  </w:t>
-      </w:r>
-      <w:r>
-        <w:br/>
+        <w:t xml:space="preserve">Julia</w:t>
+      </w:r>
+      <w:r>
+        <w:t xml:space="preserve">-код, ноутбук</w:t>
+      </w:r>
+      <w:r>
+        <w:t xml:space="preserve"> </w:t>
       </w:r>
       <w:r>
         <w:rPr>
           <w:rStyle w:val="VerbatimChar"/>
         </w:rPr>
-        <w:t xml:space="preserve">    **Группа:** Номер группы  </w:t>
-      </w:r>
-      <w:r>
-        <w:br/>
+        <w:t xml:space="preserve">ipynb</w:t>
+      </w:r>
+      <w:r>
+        <w:t xml:space="preserve"> </w:t>
+      </w:r>
+      <w:r>
+        <w:t xml:space="preserve">и итоговые отчётные материалы.</w:t>
+      </w:r>
+    </w:p>
+    <w:bookmarkEnd w:id="10"/>
+    <w:bookmarkStart w:id="11" w:name="ход-выполнения"/>
+    <w:p>
+      <w:pPr>
+        <w:pStyle w:val="Heading2"/>
+      </w:pPr>
+      <w:r>
+        <w:t xml:space="preserve">Ход выполнения</w:t>
+      </w:r>
+    </w:p>
+    <w:p>
+      <w:pPr>
+        <w:pStyle w:val="Compact"/>
+        <w:numPr>
+          <w:ilvl w:val="0"/>
+          <w:numId w:val="1001"/>
+        </w:numPr>
+      </w:pPr>
+      <w:r>
+        <w:t xml:space="preserve">Подготовлен литературный источник в формате</w:t>
+      </w:r>
+      <w:r>
+        <w:t xml:space="preserve"> </w:t>
       </w:r>
       <w:r>
         <w:rPr>
           <w:rStyle w:val="VerbatimChar"/>
         </w:rPr>
-        <w:t xml:space="preserve">    **Преподаватель:** Кулябов Дмитрий Сергеевич, преподаватель дисциплины  </w:t>
-      </w:r>
-      <w:r>
-        <w:br/>
+        <w:t xml:space="preserve">qmd</w:t>
+      </w:r>
+      <w:r>
+        <w:t xml:space="preserve">.</w:t>
+      </w:r>
+    </w:p>
+    <w:p>
+      <w:pPr>
+        <w:pStyle w:val="Compact"/>
+        <w:numPr>
+          <w:ilvl w:val="0"/>
+          <w:numId w:val="1001"/>
+        </w:numPr>
+      </w:pPr>
+      <w:r>
+        <w:t xml:space="preserve">Из источника автоматически извлечён исполняемый код</w:t>
+      </w:r>
+      <w:r>
+        <w:t xml:space="preserve"> </w:t>
       </w:r>
       <w:r>
         <w:rPr>
           <w:rStyle w:val="VerbatimChar"/>
         </w:rPr>
-        <w:t xml:space="preserve">    **Организация:** Российский университет дружбы народов имени Патриса Лумумбы  </w:t>
-      </w:r>
-      <w:r>
-        <w:br/>
-      </w:r>
-      <w:r>
-        <w:rPr>
-          <w:rStyle w:val="VerbatimChar"/>
-        </w:rPr>
-        <w:t xml:space="preserve">    **Год:** 2026</w:t>
-      </w:r>
-      <w:r>
-        <w:br/>
-      </w:r>
-      <w:r>
-        <w:br/>
-      </w:r>
-      <w:r>
-        <w:rPr>
-          <w:rStyle w:val="VerbatimChar"/>
-        </w:rPr>
-        <w:t xml:space="preserve">    ## Цель работы</w:t>
-      </w:r>
-      <w:r>
-        <w:br/>
-      </w:r>
-      <w:r>
-        <w:br/>
-      </w:r>
-      <w:r>
-        <w:rPr>
-          <w:rStyle w:val="VerbatimChar"/>
-        </w:rPr>
-        <w:t xml:space="preserve">    Освоить структуру проекта, литературный стиль исходников и базовую модель экспоненциального роста.</w:t>
-      </w:r>
-      <w:r>
-        <w:br/>
-      </w:r>
-      <w:r>
-        <w:br/>
-      </w:r>
-      <w:r>
-        <w:rPr>
-          <w:rStyle w:val="VerbatimChar"/>
-        </w:rPr>
-        <w:t xml:space="preserve">    ## Теоретические сведения</w:t>
-      </w:r>
-      <w:r>
-        <w:br/>
-      </w:r>
-      <w:r>
-        <w:br/>
-      </w:r>
-      <w:r>
-        <w:rPr>
-          <w:rStyle w:val="VerbatimChar"/>
-        </w:rPr>
-        <w:t xml:space="preserve">    Работа опирается на классические результаты и подходы, описанные в литературе [@malthus1798]. В рамках лабораторной работы использован литературный формат исходников: основной сценарий хранится в `qmd`, из него автоматически генерируются чистый `Julia`-код, ноутбук `ipynb` и документы для отчётности.</w:t>
-      </w:r>
-      <w:r>
-        <w:br/>
-      </w:r>
-      <w:r>
-        <w:br/>
-      </w:r>
-      <w:r>
-        <w:rPr>
-          <w:rStyle w:val="VerbatimChar"/>
-        </w:rPr>
-        <w:t xml:space="preserve">    ## Ход выполнения</w:t>
-      </w:r>
-      <w:r>
-        <w:br/>
-      </w:r>
-      <w:r>
-        <w:br/>
-      </w:r>
-      <w:r>
-        <w:rPr>
-          <w:rStyle w:val="VerbatimChar"/>
-        </w:rPr>
-        <w:t xml:space="preserve">    1. Подготовлен литературный источник в формате `qmd`.</w:t>
-      </w:r>
-      <w:r>
-        <w:br/>
-      </w:r>
-      <w:r>
-        <w:rPr>
-          <w:rStyle w:val="VerbatimChar"/>
-        </w:rPr>
-        <w:t xml:space="preserve">    2. Из источника автоматически извлечён чистый исполняемый код `Julia`.</w:t>
-      </w:r>
-      <w:r>
-        <w:br/>
-      </w:r>
-      <w:r>
-        <w:rPr>
-          <w:rStyle w:val="VerbatimChar"/>
-        </w:rPr>
-        <w:t xml:space="preserve">    3. Проведён вычислительный эксперимент и сохранены табличные результаты.</w:t>
-      </w:r>
-      <w:r>
-        <w:br/>
-      </w:r>
-      <w:r>
-        <w:rPr>
-          <w:rStyle w:val="VerbatimChar"/>
-        </w:rPr>
-        <w:t xml:space="preserve">    4. На основе табличных данных построены иллюстрации и сводные таблицы.</w:t>
-      </w:r>
-      <w:r>
-        <w:br/>
-      </w:r>
-      <w:r>
-        <w:br/>
-      </w:r>
-      <w:r>
-        <w:rPr>
-          <w:rStyle w:val="VerbatimChar"/>
-        </w:rPr>
-        <w:t xml:space="preserve">    ## Результаты моделирования</w:t>
-      </w:r>
-      <w:r>
-        <w:br/>
-      </w:r>
-      <w:r>
-        <w:br/>
-      </w:r>
-      <w:r>
-        <w:rPr>
-          <w:rStyle w:val="VerbatimChar"/>
-        </w:rPr>
-        <w:t xml:space="preserve">    ![Сравнение аналитического решения и схемы Эйлера](../results/figures/growth_main.png){#fig:lab01-main}</w:t>
-      </w:r>
-    </w:p>
-    <w:bookmarkStart w:id="12" w:name="fig:lab01-sweep"/>
-    <w:p>
-      <w:pPr>
-        <w:pStyle w:val="CaptionedFigure"/>
+        <w:t xml:space="preserve">Julia</w:t>
+      </w:r>
+      <w:r>
+        <w:t xml:space="preserve">.</w:t>
+      </w:r>
+    </w:p>
+    <w:p>
+      <w:pPr>
+        <w:pStyle w:val="Compact"/>
+        <w:numPr>
+          <w:ilvl w:val="0"/>
+          <w:numId w:val="1001"/>
+        </w:numPr>
+      </w:pPr>
+      <w:r>
+        <w:t xml:space="preserve">Проведён вычислительный эксперимент и сохранены табличные результаты.</w:t>
+      </w:r>
+    </w:p>
+    <w:p>
+      <w:pPr>
+        <w:pStyle w:val="Compact"/>
+        <w:numPr>
+          <w:ilvl w:val="0"/>
+          <w:numId w:val="1001"/>
+        </w:numPr>
+      </w:pPr>
+      <w:r>
+        <w:t xml:space="preserve">На основе результатов построены графики и подготовлены материалы для отчёта и презентации.</w:t>
+      </w:r>
+    </w:p>
+    <w:bookmarkEnd w:id="11"/>
+    <w:bookmarkStart w:id="18" w:name="результаты-моделирования"/>
+    <w:p>
+      <w:pPr>
+        <w:pStyle w:val="Heading2"/>
+      </w:pPr>
+      <w:r>
+        <w:t xml:space="preserve">Результаты моделирования</w:t>
+      </w:r>
+    </w:p>
+    <w:p>
+      <w:pPr>
+        <w:pStyle w:val="FirstParagraph"/>
       </w:pPr>
       <w:r>
         <w:drawing>
           <wp:inline>
             <wp:extent cx="5334000" cy="3200399"/>
             <wp:effectExtent b="0" l="0" r="0" t="0"/>
-            <wp:docPr descr="Влияние коэффициента роста на траекторию модели" title="" id="10" name="Picture"/>
+            <wp:docPr descr="Сравнение аналитического решения и схемы Эйлера" title="" id="13" name="Picture"/>
             <a:graphic>
               <a:graphicData uri="http://schemas.openxmlformats.org/drawingml/2006/picture">
                 <pic:pic>
                   <pic:nvPicPr>
-                    <pic:cNvPr descr="../results/figures/growth_sweep.png" id="11" name="Picture"/>
+                    <pic:cNvPr descr="../results/figures/growth_main.png" id="14" name="Picture"/>
                     <pic:cNvPicPr>
                       <a:picLocks noChangeArrowheads="1" noChangeAspect="1"/>
                     </pic:cNvPicPr>
                   </pic:nvPicPr>
                   <pic:blipFill>
-                    <a:blip r:embed="rId9"/>
+                    <a:blip r:embed="rId12"/>
                     <a:stretch>
                       <a:fillRect/>
                     </a:stretch>
@@ -237,37 +414,234 @@
           </wp:inline>
         </w:drawing>
       </w:r>
-    </w:p>
-    <w:p>
-      <w:pPr>
-        <w:pStyle w:val="ImageCaption"/>
-      </w:pPr>
-      <w:r>
-        <w:t xml:space="preserve">Влияние коэффициента роста на траекторию модели</w:t>
-      </w:r>
-    </w:p>
-    <w:bookmarkEnd w:id="12"/>
-    <w:p>
-      <w:pPr>
-        <w:pStyle w:val="SourceCode"/>
-      </w:pPr>
+      <w:r>
+        <w:t xml:space="preserve"> </w:t>
+      </w:r>
       <w:r>
         <w:rPr>
-          <w:rStyle w:val="VerbatimChar"/>
+          <w:i/>
+          <w:iCs/>
         </w:rPr>
-        <w:t xml:space="preserve">    Таблица основных результатов:</w:t>
-      </w:r>
-      <w:r>
-        <w:br/>
-      </w:r>
-      <w:r>
-        <w:br/>
+        <w:t xml:space="preserve">Рисунок 1 — Сравнение аналитического решения и схемы Эйлера</w:t>
+      </w:r>
+    </w:p>
+    <w:p>
+      <w:pPr>
+        <w:pStyle w:val="BodyText"/>
+      </w:pPr>
+      <w:r>
+        <w:drawing>
+          <wp:inline>
+            <wp:extent cx="5334000" cy="3200399"/>
+            <wp:effectExtent b="0" l="0" r="0" t="0"/>
+            <wp:docPr descr="Влияние коэффициента роста на траекторию модели" title="" id="16" name="Picture"/>
+            <a:graphic>
+              <a:graphicData uri="http://schemas.openxmlformats.org/drawingml/2006/picture">
+                <pic:pic>
+                  <pic:nvPicPr>
+                    <pic:cNvPr descr="../results/figures/growth_sweep.png" id="17" name="Picture"/>
+                    <pic:cNvPicPr>
+                      <a:picLocks noChangeArrowheads="1" noChangeAspect="1"/>
+                    </pic:cNvPicPr>
+                  </pic:nvPicPr>
+                  <pic:blipFill>
+                    <a:blip r:embed="rId15"/>
+                    <a:stretch>
+                      <a:fillRect/>
+                    </a:stretch>
+                  </pic:blipFill>
+                  <pic:spPr bwMode="auto">
+                    <a:xfrm>
+                      <a:off x="0" y="0"/>
+                      <a:ext cx="5334000" cy="3200399"/>
+                    </a:xfrm>
+                    <a:prstGeom prst="rect">
+                      <a:avLst/>
+                    </a:prstGeom>
+                    <a:noFill/>
+                    <a:ln w="9525">
+                      <a:noFill/>
+                      <a:headEnd/>
+                      <a:tailEnd/>
+                    </a:ln>
+                  </pic:spPr>
+                </pic:pic>
+              </a:graphicData>
+            </a:graphic>
+          </wp:inline>
+        </w:drawing>
+      </w:r>
+      <w:r>
+        <w:t xml:space="preserve"> </w:t>
       </w:r>
       <w:r>
         <w:rPr>
-          <w:rStyle w:val="VerbatimChar"/>
+          <w:i/>
+          <w:iCs/>
         </w:rPr>
-        <w:t xml:space="preserve">    |   alpha |   Максимум |</w:t>
+        <w:t xml:space="preserve">Рисунок 2 — Влияние коэффициента роста на траекторию модели</w:t>
+      </w:r>
+    </w:p>
+    <w:p>
+      <w:pPr>
+        <w:pStyle w:val="BodyText"/>
+      </w:pPr>
+      <w:r>
+        <w:t xml:space="preserve">Таблица основных результатов:</w:t>
+      </w:r>
+    </w:p>
+    <w:tbl>
+      <w:tblPr>
+        <w:tblStyle w:val="Table"/>
+        <w:tblW w:type="auto" w:w="0"/>
+        <w:tblLook w:firstRow="1" w:lastRow="0" w:firstColumn="0" w:lastColumn="0" w:noHBand="0" w:noVBand="0" w:val="0020"/>
+      </w:tblPr>
+      <w:tblGrid>
+        <w:gridCol w:w="3960"/>
+        <w:gridCol w:w="3960"/>
+      </w:tblGrid>
+      <w:tr>
+        <w:trPr>
+          <w:tblHeader w:val="on"/>
+        </w:trPr>
+        <w:tc>
+          <w:tcPr/>
+          <w:p>
+            <w:pPr>
+              <w:pStyle w:val="Compact"/>
+              <w:jc w:val="right"/>
+            </w:pPr>
+            <w:r>
+              <w:t xml:space="preserve">alpha</w:t>
+            </w:r>
+          </w:p>
+        </w:tc>
+        <w:tc>
+          <w:tcPr/>
+          <w:p>
+            <w:pPr>
+              <w:pStyle w:val="Compact"/>
+              <w:jc w:val="right"/>
+            </w:pPr>
+            <w:r>
+              <w:t xml:space="preserve">Максимум</w:t>
+            </w:r>
+          </w:p>
+        </w:tc>
+      </w:tr>
+      <w:tr>
+        <w:tc>
+          <w:tcPr/>
+          <w:p>
+            <w:pPr>
+              <w:pStyle w:val="Compact"/>
+              <w:jc w:val="right"/>
+            </w:pPr>
+            <w:r>
+              <w:t xml:space="preserve">0.15</w:t>
+            </w:r>
+          </w:p>
+        </w:tc>
+        <w:tc>
+          <w:tcPr/>
+          <w:p>
+            <w:pPr>
+              <w:pStyle w:val="Compact"/>
+              <w:jc w:val="right"/>
+            </w:pPr>
+            <w:r>
+              <w:t xml:space="preserve">60.4965</w:t>
+            </w:r>
+          </w:p>
+        </w:tc>
+      </w:tr>
+      <w:tr>
+        <w:tc>
+          <w:tcPr/>
+          <w:p>
+            <w:pPr>
+              <w:pStyle w:val="Compact"/>
+              <w:jc w:val="right"/>
+            </w:pPr>
+            <w:r>
+              <w:t xml:space="preserve">0.25</w:t>
+            </w:r>
+          </w:p>
+        </w:tc>
+        <w:tc>
+          <w:tcPr/>
+          <w:p>
+            <w:pPr>
+              <w:pStyle w:val="Compact"/>
+              <w:jc w:val="right"/>
+            </w:pPr>
+            <w:r>
+              <w:t xml:space="preserve">200.855</w:t>
+            </w:r>
+          </w:p>
+        </w:tc>
+      </w:tr>
+      <w:tr>
+        <w:tc>
+          <w:tcPr/>
+          <w:p>
+            <w:pPr>
+              <w:pStyle w:val="Compact"/>
+              <w:jc w:val="right"/>
+            </w:pPr>
+            <w:r>
+              <w:t xml:space="preserve">0.35</w:t>
+            </w:r>
+          </w:p>
+        </w:tc>
+        <w:tc>
+          <w:tcPr/>
+          <w:p>
+            <w:pPr>
+              <w:pStyle w:val="Compact"/>
+              <w:jc w:val="right"/>
+            </w:pPr>
+            <w:r>
+              <w:t xml:space="preserve">666.863</w:t>
+            </w:r>
+          </w:p>
+        </w:tc>
+      </w:tr>
+      <w:tr>
+        <w:tc>
+          <w:tcPr/>
+          <w:p>
+            <w:pPr>
+              <w:pStyle w:val="Compact"/>
+              <w:jc w:val="right"/>
+            </w:pPr>
+            <w:r>
+              <w:t xml:space="preserve">0.45</w:t>
+            </w:r>
+          </w:p>
+        </w:tc>
+        <w:tc>
+          <w:tcPr/>
+          <w:p>
+            <w:pPr>
+              <w:pStyle w:val="Compact"/>
+              <w:jc w:val="right"/>
+            </w:pPr>
+            <w:r>
+              <w:t xml:space="preserve">2214.06</w:t>
+            </w:r>
+          </w:p>
+        </w:tc>
+      </w:tr>
+    </w:tbl>
+    <w:bookmarkEnd w:id="18"/>
+    <w:bookmarkStart w:id="19" w:name="анализ-результатов"/>
+    <w:p>
+      <w:pPr>
+        <w:pStyle w:val="Heading2"/>
+      </w:pPr>
+      <w:r>
+        <w:t xml:space="preserve">Анализ результатов</w:t>
       </w:r>
     </w:p>
     <w:p>
@@ -275,93 +649,51 @@
         <w:pStyle w:val="FirstParagraph"/>
       </w:pPr>
       <w:r>
-        <w:t xml:space="preserve">|——–:|———–:|</w:t>
-      </w:r>
-      <w:r>
-        <w:t xml:space="preserve"> </w:t>
-      </w:r>
-      <w:r>
-        <w:t xml:space="preserve">| 0.15 | 60.4965 |</w:t>
-      </w:r>
-      <w:r>
-        <w:t xml:space="preserve"> </w:t>
-      </w:r>
-      <w:r>
-        <w:t xml:space="preserve">| 0.25 | 200.855 |</w:t>
-      </w:r>
-      <w:r>
-        <w:t xml:space="preserve"> </w:t>
-      </w:r>
-      <w:r>
-        <w:t xml:space="preserve">| 0.35 | 666.863 |</w:t>
-      </w:r>
-      <w:r>
-        <w:t xml:space="preserve"> </w:t>
-      </w:r>
-      <w:r>
-        <w:t xml:space="preserve">| 0.45 | 2214.06 |</w:t>
-      </w:r>
-    </w:p>
-    <w:p>
-      <w:pPr>
-        <w:pStyle w:val="SourceCode"/>
-      </w:pPr>
-      <w:r>
-        <w:rPr>
-          <w:rStyle w:val="VerbatimChar"/>
-        </w:rPr>
-        <w:t xml:space="preserve">    ## Анализ результатов</w:t>
-      </w:r>
-      <w:r>
-        <w:br/>
-      </w:r>
-      <w:r>
-        <w:br/>
-      </w:r>
-      <w:r>
-        <w:rPr>
-          <w:rStyle w:val="VerbatimChar"/>
-        </w:rPr>
-        <w:t xml:space="preserve">    График @fig:lab01-main показывает основную динамику модели, а @fig:lab01-sweep иллюстрирует чувствительность модели к изменению параметров. По полученным траекториям видно, что модель корректно воспроизводит ожидаемое качественное поведение системы и может использоваться для сравнительного анализа сценариев.</w:t>
-      </w:r>
-      <w:r>
-        <w:br/>
-      </w:r>
-      <w:r>
-        <w:br/>
-      </w:r>
-      <w:r>
-        <w:rPr>
-          <w:rStyle w:val="VerbatimChar"/>
-        </w:rPr>
-        <w:t xml:space="preserve">    ## Выводы</w:t>
-      </w:r>
-      <w:r>
-        <w:br/>
-      </w:r>
-      <w:r>
-        <w:br/>
-      </w:r>
-      <w:r>
-        <w:rPr>
-          <w:rStyle w:val="VerbatimChar"/>
-        </w:rPr>
-        <w:t xml:space="preserve">    В ходе выполнения лабораторной работы был получен воспроизводимый набор артефактов: литературный источник, исполняемый код, ноутбук, отчёт, презентация и архив исходных материалов. Автоматическая сборка позволяет быстро обновлять результаты после изменения параметров эксперимента.</w:t>
-      </w:r>
-      <w:r>
-        <w:br/>
-      </w:r>
-      <w:r>
-        <w:br/>
-      </w:r>
-      <w:r>
-        <w:rPr>
-          <w:rStyle w:val="VerbatimChar"/>
-        </w:rPr>
-        <w:t xml:space="preserve">    ## Список литературы</w:t>
-      </w:r>
-    </w:p>
-    <w:bookmarkEnd w:id="13"/>
+        <w:t xml:space="preserve">Первый график отражает основную динамику исследуемой модели, а второй показывает чувствительность результата к изменению параметров. По полученным траекториям видно, что модель устойчиво воспроизводит ожидаемое качественное поведение системы и подходит для сравнительного анализа сценариев.</w:t>
+      </w:r>
+    </w:p>
+    <w:bookmarkEnd w:id="19"/>
+    <w:bookmarkStart w:id="20" w:name="выводы"/>
+    <w:p>
+      <w:pPr>
+        <w:pStyle w:val="Heading2"/>
+      </w:pPr>
+      <w:r>
+        <w:t xml:space="preserve">Выводы</w:t>
+      </w:r>
+    </w:p>
+    <w:p>
+      <w:pPr>
+        <w:pStyle w:val="FirstParagraph"/>
+      </w:pPr>
+      <w:r>
+        <w:t xml:space="preserve">В ходе выполнения лабораторной работы получен полный воспроизводимый комплект материалов: литературный источник, исполняемый код, ноутбук, отчёт, презентация и архив исходных данных. Единая автоматическая сборка позволяет быстро обновлять результаты после изменения параметров эксперимента.</w:t>
+      </w:r>
+    </w:p>
+    <w:bookmarkEnd w:id="20"/>
+    <w:bookmarkStart w:id="21" w:name="список-литературы"/>
+    <w:p>
+      <w:pPr>
+        <w:pStyle w:val="Heading2"/>
+      </w:pPr>
+      <w:r>
+        <w:t xml:space="preserve">Список литературы</w:t>
+      </w:r>
+    </w:p>
+    <w:p>
+      <w:pPr>
+        <w:pStyle w:val="Compact"/>
+        <w:numPr>
+          <w:ilvl w:val="0"/>
+          <w:numId w:val="1002"/>
+        </w:numPr>
+      </w:pPr>
+      <w:r>
+        <w:t xml:space="preserve">Thomas Robert Malthus. An Essay on the Principle of Population. J. Johnson, 1798.</w:t>
+      </w:r>
+    </w:p>
+    <w:bookmarkEnd w:id="21"/>
+    <w:bookmarkEnd w:id="22"/>
     <w:sectPr>
       <w:footnotePr>
         <w:numRestart w:val="eachSect"/>
@@ -472,8 +804,153 @@
       </w:pPr>
     </w:lvl>
   </w:abstractNum>
+  <w:abstractNum w:abstractNumId="99411">
+    <w:nsid w:val="00A99411"/>
+    <w:multiLevelType w:val="multilevel"/>
+    <w:lvl w:ilvl="0">
+      <w:start w:val="1"/>
+      <w:numFmt w:val="decimal"/>
+      <w:lvlText w:val="%1."/>
+      <w:lvlJc w:val="left"/>
+      <w:pPr>
+        <w:ind w:left="720" w:hanging="360"/>
+      </w:pPr>
+    </w:lvl>
+    <w:lvl w:ilvl="1">
+      <w:start w:val="1"/>
+      <w:numFmt w:val="decimal"/>
+      <w:lvlText w:val="%2."/>
+      <w:lvlJc w:val="left"/>
+      <w:pPr>
+        <w:ind w:left="1440" w:hanging="360"/>
+      </w:pPr>
+    </w:lvl>
+    <w:lvl w:ilvl="2">
+      <w:start w:val="1"/>
+      <w:numFmt w:val="decimal"/>
+      <w:lvlText w:val="%3."/>
+      <w:lvlJc w:val="left"/>
+      <w:pPr>
+        <w:ind w:left="2160" w:hanging="360"/>
+      </w:pPr>
+    </w:lvl>
+    <w:lvl w:ilvl="3">
+      <w:start w:val="1"/>
+      <w:numFmt w:val="decimal"/>
+      <w:lvlText w:val="%4."/>
+      <w:lvlJc w:val="left"/>
+      <w:pPr>
+        <w:ind w:left="2880" w:hanging="360"/>
+      </w:pPr>
+    </w:lvl>
+    <w:lvl w:ilvl="4">
+      <w:start w:val="1"/>
+      <w:numFmt w:val="decimal"/>
+      <w:lvlText w:val="%5."/>
+      <w:lvlJc w:val="left"/>
+      <w:pPr>
+        <w:ind w:left="3600" w:hanging="360"/>
+      </w:pPr>
+    </w:lvl>
+    <w:lvl w:ilvl="5">
+      <w:start w:val="1"/>
+      <w:numFmt w:val="decimal"/>
+      <w:lvlText w:val="%6."/>
+      <w:lvlJc w:val="left"/>
+      <w:pPr>
+        <w:ind w:left="4320" w:hanging="360"/>
+      </w:pPr>
+    </w:lvl>
+    <w:lvl w:ilvl="6">
+      <w:start w:val="1"/>
+      <w:numFmt w:val="decimal"/>
+      <w:lvlText w:val="%7."/>
+      <w:lvlJc w:val="left"/>
+      <w:pPr>
+        <w:ind w:left="5040" w:hanging="360"/>
+      </w:pPr>
+    </w:lvl>
+    <w:lvl w:ilvl="7">
+      <w:start w:val="1"/>
+      <w:numFmt w:val="decimal"/>
+      <w:lvlText w:val="%8."/>
+      <w:lvlJc w:val="left"/>
+      <w:pPr>
+        <w:ind w:left="5760" w:hanging="360"/>
+      </w:pPr>
+    </w:lvl>
+    <w:lvl w:ilvl="8">
+      <w:start w:val="1"/>
+      <w:numFmt w:val="decimal"/>
+      <w:lvlText w:val="%9."/>
+      <w:lvlJc w:val="left"/>
+      <w:pPr>
+        <w:ind w:left="6480" w:hanging="360"/>
+      </w:pPr>
+    </w:lvl>
+  </w:abstractNum>
   <w:num w:numId="1000">
     <w:abstractNumId w:val="990"/>
+  </w:num>
+  <w:num w:numId="1001">
+    <w:abstractNumId w:val="99411"/>
+    <w:lvlOverride w:ilvl="0">
+      <w:startOverride w:val="1"/>
+    </w:lvlOverride>
+    <w:lvlOverride w:ilvl="1">
+      <w:startOverride w:val="1"/>
+    </w:lvlOverride>
+    <w:lvlOverride w:ilvl="2">
+      <w:startOverride w:val="1"/>
+    </w:lvlOverride>
+    <w:lvlOverride w:ilvl="3">
+      <w:startOverride w:val="1"/>
+    </w:lvlOverride>
+    <w:lvlOverride w:ilvl="4">
+      <w:startOverride w:val="1"/>
+    </w:lvlOverride>
+    <w:lvlOverride w:ilvl="5">
+      <w:startOverride w:val="1"/>
+    </w:lvlOverride>
+    <w:lvlOverride w:ilvl="6">
+      <w:startOverride w:val="1"/>
+    </w:lvlOverride>
+    <w:lvlOverride w:ilvl="7">
+      <w:startOverride w:val="1"/>
+    </w:lvlOverride>
+    <w:lvlOverride w:ilvl="8">
+      <w:startOverride w:val="1"/>
+    </w:lvlOverride>
+  </w:num>
+  <w:num w:numId="1002">
+    <w:abstractNumId w:val="99411"/>
+    <w:lvlOverride w:ilvl="0">
+      <w:startOverride w:val="1"/>
+    </w:lvlOverride>
+    <w:lvlOverride w:ilvl="1">
+      <w:startOverride w:val="1"/>
+    </w:lvlOverride>
+    <w:lvlOverride w:ilvl="2">
+      <w:startOverride w:val="1"/>
+    </w:lvlOverride>
+    <w:lvlOverride w:ilvl="3">
+      <w:startOverride w:val="1"/>
+    </w:lvlOverride>
+    <w:lvlOverride w:ilvl="4">
+      <w:startOverride w:val="1"/>
+    </w:lvlOverride>
+    <w:lvlOverride w:ilvl="5">
+      <w:startOverride w:val="1"/>
+    </w:lvlOverride>
+    <w:lvlOverride w:ilvl="6">
+      <w:startOverride w:val="1"/>
+    </w:lvlOverride>
+    <w:lvlOverride w:ilvl="7">
+      <w:startOverride w:val="1"/>
+    </w:lvlOverride>
+    <w:lvlOverride w:ilvl="8">
+      <w:startOverride w:val="1"/>
+    </w:lvlOverride>
   </w:num>
 </w:numbering>
 </file>

</xml_diff>

<commit_message>
feat(course): expand lab reports and presentations
</commit_message>
<xml_diff>
--- a/labs/lab01/report/report.docx
+++ b/labs/lab01/report/report.docx
@@ -2,7 +2,7 @@
 <file path=word/document.xml><?xml version="1.0" encoding="utf-8"?>
 <w:document xmlns:w="http://schemas.openxmlformats.org/wordprocessingml/2006/main" xmlns:m="http://schemas.openxmlformats.org/officeDocument/2006/math" xmlns:r="http://schemas.openxmlformats.org/officeDocument/2006/relationships" xmlns:o="urn:schemas-microsoft-com:office:office" xmlns:v="urn:schemas-microsoft-com:vml" xmlns:w10="urn:schemas-microsoft-com:office:word" xmlns:a="http://schemas.openxmlformats.org/drawingml/2006/main" xmlns:pic="http://schemas.openxmlformats.org/drawingml/2006/picture" xmlns:wp="http://schemas.openxmlformats.org/drawingml/2006/wordprocessingDrawing">
   <w:body>
-    <w:bookmarkStart w:id="22" w:name="Xa0f9e00941c799308ce9bfc80984b612e63703f"/>
+    <w:bookmarkStart w:id="27" w:name="Xa0f9e00941c799308ce9bfc80984b612e63703f"/>
     <w:p>
       <w:pPr>
         <w:pStyle w:val="Heading1"/>
@@ -220,13 +220,13 @@
       </w:r>
     </w:p>
     <w:bookmarkEnd w:id="9"/>
-    <w:bookmarkStart w:id="10" w:name="теоретические-сведения"/>
+    <w:bookmarkStart w:id="10" w:name="постановка-задачи"/>
     <w:p>
       <w:pPr>
         <w:pStyle w:val="Heading2"/>
       </w:pPr>
       <w:r>
-        <w:t xml:space="preserve">Теоретические сведения</w:t>
+        <w:t xml:space="preserve">Постановка задачи</w:t>
       </w:r>
     </w:p>
     <w:p>
@@ -234,56 +234,7 @@
         <w:pStyle w:val="FirstParagraph"/>
       </w:pPr>
       <w:r>
-        <w:t xml:space="preserve">Работа опирается на классические модели и публикации по теме имитационного моделирования. Для лабораторной работы сохранён воспроизводимый подход: основной сценарий хранится в</w:t>
-      </w:r>
-      <w:r>
-        <w:t xml:space="preserve"> </w:t>
-      </w:r>
-      <w:r>
-        <w:rPr>
-          <w:rStyle w:val="VerbatimChar"/>
-        </w:rPr>
-        <w:t xml:space="preserve">qmd</w:t>
-      </w:r>
-      <w:r>
-        <w:t xml:space="preserve">, из него автоматически формируются чистый</w:t>
-      </w:r>
-      <w:r>
-        <w:t xml:space="preserve"> </w:t>
-      </w:r>
-      <w:r>
-        <w:rPr>
-          <w:rStyle w:val="VerbatimChar"/>
-        </w:rPr>
-        <w:t xml:space="preserve">Julia</w:t>
-      </w:r>
-      <w:r>
-        <w:t xml:space="preserve">-код, ноутбук</w:t>
-      </w:r>
-      <w:r>
-        <w:t xml:space="preserve"> </w:t>
-      </w:r>
-      <w:r>
-        <w:rPr>
-          <w:rStyle w:val="VerbatimChar"/>
-        </w:rPr>
-        <w:t xml:space="preserve">ipynb</w:t>
-      </w:r>
-      <w:r>
-        <w:t xml:space="preserve"> </w:t>
-      </w:r>
-      <w:r>
-        <w:t xml:space="preserve">и итоговые отчётные материалы.</w:t>
-      </w:r>
-    </w:p>
-    <w:bookmarkEnd w:id="10"/>
-    <w:bookmarkStart w:id="11" w:name="ход-выполнения"/>
-    <w:p>
-      <w:pPr>
-        <w:pStyle w:val="Heading2"/>
-      </w:pPr>
-      <w:r>
-        <w:t xml:space="preserve">Ход выполнения</w:t>
+        <w:t xml:space="preserve">В рамках лабораторной работы необходимо:</w:t>
       </w:r>
     </w:p>
     <w:p>
@@ -295,19 +246,7 @@
         </w:numPr>
       </w:pPr>
       <w:r>
-        <w:t xml:space="preserve">Подготовлен литературный источник в формате</w:t>
-      </w:r>
-      <w:r>
-        <w:t xml:space="preserve"> </w:t>
-      </w:r>
-      <w:r>
-        <w:rPr>
-          <w:rStyle w:val="VerbatimChar"/>
-        </w:rPr>
-        <w:t xml:space="preserve">qmd</w:t>
-      </w:r>
-      <w:r>
-        <w:t xml:space="preserve">.</w:t>
+        <w:t xml:space="preserve">задать начальное значение популяции и коэффициент роста;</w:t>
       </w:r>
     </w:p>
     <w:p>
@@ -319,19 +258,7 @@
         </w:numPr>
       </w:pPr>
       <w:r>
-        <w:t xml:space="preserve">Из источника автоматически извлечён исполняемый код</w:t>
-      </w:r>
-      <w:r>
-        <w:t xml:space="preserve"> </w:t>
-      </w:r>
-      <w:r>
-        <w:rPr>
-          <w:rStyle w:val="VerbatimChar"/>
-        </w:rPr>
-        <w:t xml:space="preserve">Julia</w:t>
-      </w:r>
-      <w:r>
-        <w:t xml:space="preserve">.</w:t>
+        <w:t xml:space="preserve">построить аналитическое решение и численное приближение методом Эйлера;</w:t>
       </w:r>
     </w:p>
     <w:p>
@@ -343,7 +270,7 @@
         </w:numPr>
       </w:pPr>
       <w:r>
-        <w:t xml:space="preserve">Проведён вычислительный эксперимент и сохранены табличные результаты.</w:t>
+        <w:t xml:space="preserve">сравнить траектории двух подходов на общем графике;</w:t>
       </w:r>
     </w:p>
     <w:p>
@@ -355,11 +282,175 @@
         </w:numPr>
       </w:pPr>
       <w:r>
-        <w:t xml:space="preserve">На основе результатов построены графики и подготовлены материалы для отчёта и презентации.</w:t>
+        <w:t xml:space="preserve">выполнить серию прогонов при разных значениях коэффициента роста.</w:t>
+      </w:r>
+    </w:p>
+    <w:bookmarkEnd w:id="10"/>
+    <w:bookmarkStart w:id="11" w:name="теоретические-сведения"/>
+    <w:p>
+      <w:pPr>
+        <w:pStyle w:val="Heading2"/>
+      </w:pPr>
+      <w:r>
+        <w:t xml:space="preserve">Теоретические сведения</w:t>
+      </w:r>
+    </w:p>
+    <w:p>
+      <w:pPr>
+        <w:pStyle w:val="FirstParagraph"/>
+      </w:pPr>
+      <w:r>
+        <w:t xml:space="preserve">Модель экспоненциального роста относится к базовым дифференциальным моделям и описывает процесс, в котором скорость изменения величины пропорциональна её текущему значению. Такая постановка применяется в демографии, эпидемиологии, экономике и при анализе ранних стадий распространения процессов без ограничивающих факторов.</w:t>
+      </w:r>
+      <w:r>
+        <w:t xml:space="preserve"> </w:t>
+      </w:r>
+      <w:r>
+        <w:t xml:space="preserve">Для лабораторной работы важно сопоставить точное аналитическое решение с численной схемой. Метод Эйлера прост в реализации и хорошо показывает, как шаг интегрирования и параметры модели влияют на точность вычислений, накопление ошибки и качество аппроксимации траектории.</w:t>
       </w:r>
     </w:p>
     <w:bookmarkEnd w:id="11"/>
-    <w:bookmarkStart w:id="18" w:name="результаты-моделирования"/>
+    <w:bookmarkStart w:id="12" w:name="X90ec9b3c0313e0d5781da0417c1fef4e264c20d"/>
+    <w:p>
+      <w:pPr>
+        <w:pStyle w:val="Heading2"/>
+      </w:pPr>
+      <w:r>
+        <w:t xml:space="preserve">Исходные параметры и организация эксперимента</w:t>
+      </w:r>
+    </w:p>
+    <w:p>
+      <w:pPr>
+        <w:pStyle w:val="Compact"/>
+        <w:numPr>
+          <w:ilvl w:val="0"/>
+          <w:numId w:val="1002"/>
+        </w:numPr>
+      </w:pPr>
+      <w:r>
+        <w:t xml:space="preserve">начальное значение модели: u0 = 10.0;</w:t>
+      </w:r>
+    </w:p>
+    <w:p>
+      <w:pPr>
+        <w:pStyle w:val="Compact"/>
+        <w:numPr>
+          <w:ilvl w:val="0"/>
+          <w:numId w:val="1002"/>
+        </w:numPr>
+      </w:pPr>
+      <w:r>
+        <w:t xml:space="preserve">основной коэффициент роста: alpha = 0.35;</w:t>
+      </w:r>
+    </w:p>
+    <w:p>
+      <w:pPr>
+        <w:pStyle w:val="Compact"/>
+        <w:numPr>
+          <w:ilvl w:val="0"/>
+          <w:numId w:val="1002"/>
+        </w:numPr>
+      </w:pPr>
+      <w:r>
+        <w:t xml:space="preserve">горизонт моделирования: t_max = 12.0;</w:t>
+      </w:r>
+    </w:p>
+    <w:p>
+      <w:pPr>
+        <w:pStyle w:val="Compact"/>
+        <w:numPr>
+          <w:ilvl w:val="0"/>
+          <w:numId w:val="1002"/>
+        </w:numPr>
+      </w:pPr>
+      <w:r>
+        <w:t xml:space="preserve">шаг численного интегрирования: dt = 0.1;</w:t>
+      </w:r>
+    </w:p>
+    <w:p>
+      <w:pPr>
+        <w:pStyle w:val="Compact"/>
+        <w:numPr>
+          <w:ilvl w:val="0"/>
+          <w:numId w:val="1002"/>
+        </w:numPr>
+      </w:pPr>
+      <w:r>
+        <w:t xml:space="preserve">параметрический анализ проводится для alpha = 0.15, 0.25, 0.35, 0.45.</w:t>
+      </w:r>
+    </w:p>
+    <w:bookmarkEnd w:id="12"/>
+    <w:bookmarkStart w:id="13" w:name="ход-выполнения-лабораторной-работы"/>
+    <w:p>
+      <w:pPr>
+        <w:pStyle w:val="Heading2"/>
+      </w:pPr>
+      <w:r>
+        <w:t xml:space="preserve">Ход выполнения лабораторной работы</w:t>
+      </w:r>
+    </w:p>
+    <w:p>
+      <w:pPr>
+        <w:pStyle w:val="Compact"/>
+        <w:numPr>
+          <w:ilvl w:val="0"/>
+          <w:numId w:val="1003"/>
+        </w:numPr>
+      </w:pPr>
+      <w:r>
+        <w:t xml:space="preserve">Подготовлен литературный источник с описанием модели и исполняемым кодом.</w:t>
+      </w:r>
+    </w:p>
+    <w:p>
+      <w:pPr>
+        <w:pStyle w:val="Compact"/>
+        <w:numPr>
+          <w:ilvl w:val="0"/>
+          <w:numId w:val="1003"/>
+        </w:numPr>
+      </w:pPr>
+      <w:r>
+        <w:t xml:space="preserve">Реализованы формулы аналитического решения и итерационная схема Эйлера.</w:t>
+      </w:r>
+    </w:p>
+    <w:p>
+      <w:pPr>
+        <w:pStyle w:val="Compact"/>
+        <w:numPr>
+          <w:ilvl w:val="0"/>
+          <w:numId w:val="1003"/>
+        </w:numPr>
+      </w:pPr>
+      <w:r>
+        <w:t xml:space="preserve">Сформированы CSV-файлы с основной траекторией и серией параметрических прогонов.</w:t>
+      </w:r>
+    </w:p>
+    <w:p>
+      <w:pPr>
+        <w:pStyle w:val="Compact"/>
+        <w:numPr>
+          <w:ilvl w:val="0"/>
+          <w:numId w:val="1003"/>
+        </w:numPr>
+      </w:pPr>
+      <w:r>
+        <w:t xml:space="preserve">На основе табличных результатов автоматически построены итоговые графики.</w:t>
+      </w:r>
+    </w:p>
+    <w:p>
+      <w:pPr>
+        <w:pStyle w:val="Compact"/>
+        <w:numPr>
+          <w:ilvl w:val="0"/>
+          <w:numId w:val="1003"/>
+        </w:numPr>
+      </w:pPr>
+      <w:r>
+        <w:t xml:space="preserve">По полученным данным сформированы отчёт, презентация и архив исходных материалов.</w:t>
+      </w:r>
+    </w:p>
+    <w:bookmarkEnd w:id="13"/>
+    <w:bookmarkStart w:id="22" w:name="результаты-моделирования"/>
     <w:p>
       <w:pPr>
         <w:pStyle w:val="Heading2"/>
@@ -377,18 +468,18 @@
           <wp:inline>
             <wp:extent cx="5334000" cy="3200399"/>
             <wp:effectExtent b="0" l="0" r="0" t="0"/>
-            <wp:docPr descr="Сравнение аналитического решения и схемы Эйлера" title="" id="13" name="Picture"/>
+            <wp:docPr descr="Сравнение аналитического решения и схемы Эйлера" title="" id="15" name="Picture"/>
             <a:graphic>
               <a:graphicData uri="http://schemas.openxmlformats.org/drawingml/2006/picture">
                 <pic:pic>
                   <pic:nvPicPr>
-                    <pic:cNvPr descr="../results/figures/growth_main.png" id="14" name="Picture"/>
+                    <pic:cNvPr descr="../results/figures/growth_main.png" id="16" name="Picture"/>
                     <pic:cNvPicPr>
                       <a:picLocks noChangeArrowheads="1" noChangeAspect="1"/>
                     </pic:cNvPicPr>
                   </pic:nvPicPr>
                   <pic:blipFill>
-                    <a:blip r:embed="rId12"/>
+                    <a:blip r:embed="rId14"/>
                     <a:stretch>
                       <a:fillRect/>
                     </a:stretch>
@@ -434,18 +525,18 @@
           <wp:inline>
             <wp:extent cx="5334000" cy="3200399"/>
             <wp:effectExtent b="0" l="0" r="0" t="0"/>
-            <wp:docPr descr="Влияние коэффициента роста на траекторию модели" title="" id="16" name="Picture"/>
+            <wp:docPr descr="Влияние коэффициента роста на траекторию модели" title="" id="18" name="Picture"/>
             <a:graphic>
               <a:graphicData uri="http://schemas.openxmlformats.org/drawingml/2006/picture">
                 <pic:pic>
                   <pic:nvPicPr>
-                    <pic:cNvPr descr="../results/figures/growth_sweep.png" id="17" name="Picture"/>
+                    <pic:cNvPr descr="../results/figures/growth_sweep.png" id="19" name="Picture"/>
                     <pic:cNvPicPr>
                       <a:picLocks noChangeArrowheads="1" noChangeAspect="1"/>
                     </pic:cNvPicPr>
                   </pic:nvPicPr>
                   <pic:blipFill>
-                    <a:blip r:embed="rId15"/>
+                    <a:blip r:embed="rId17"/>
                     <a:stretch>
                       <a:fillRect/>
                     </a:stretch>
@@ -482,12 +573,380 @@
         <w:t xml:space="preserve">Рисунок 2 — Влияние коэффициента роста на траекторию модели</w:t>
       </w:r>
     </w:p>
-    <w:p>
-      <w:pPr>
-        <w:pStyle w:val="BodyText"/>
-      </w:pPr>
-      <w:r>
-        <w:t xml:space="preserve">Таблица основных результатов:</w:t>
+    <w:bookmarkStart w:id="20" w:name="фрагмент-таблицы-основной-траектории"/>
+    <w:p>
+      <w:pPr>
+        <w:pStyle w:val="Heading3"/>
+      </w:pPr>
+      <w:r>
+        <w:t xml:space="preserve">Фрагмент таблицы основной траектории</w:t>
+      </w:r>
+    </w:p>
+    <w:tbl>
+      <w:tblPr>
+        <w:tblStyle w:val="Table"/>
+        <w:tblW w:type="auto" w:w="0"/>
+        <w:tblLook w:firstRow="1" w:lastRow="0" w:firstColumn="0" w:lastColumn="0" w:noHBand="0" w:noVBand="0" w:val="0020"/>
+      </w:tblPr>
+      <w:tblGrid>
+        <w:gridCol w:w="2640"/>
+        <w:gridCol w:w="2640"/>
+        <w:gridCol w:w="2640"/>
+      </w:tblGrid>
+      <w:tr>
+        <w:trPr>
+          <w:tblHeader w:val="on"/>
+        </w:trPr>
+        <w:tc>
+          <w:tcPr/>
+          <w:p>
+            <w:pPr>
+              <w:pStyle w:val="Compact"/>
+              <w:jc w:val="right"/>
+            </w:pPr>
+            <w:r>
+              <w:t xml:space="preserve">time</w:t>
+            </w:r>
+          </w:p>
+        </w:tc>
+        <w:tc>
+          <w:tcPr/>
+          <w:p>
+            <w:pPr>
+              <w:pStyle w:val="Compact"/>
+              <w:jc w:val="right"/>
+            </w:pPr>
+            <w:r>
+              <w:t xml:space="preserve">analytic</w:t>
+            </w:r>
+          </w:p>
+        </w:tc>
+        <w:tc>
+          <w:tcPr/>
+          <w:p>
+            <w:pPr>
+              <w:pStyle w:val="Compact"/>
+              <w:jc w:val="right"/>
+            </w:pPr>
+            <w:r>
+              <w:t xml:space="preserve">euler</w:t>
+            </w:r>
+          </w:p>
+        </w:tc>
+      </w:tr>
+      <w:tr>
+        <w:tc>
+          <w:tcPr/>
+          <w:p>
+            <w:pPr>
+              <w:pStyle w:val="Compact"/>
+              <w:jc w:val="right"/>
+            </w:pPr>
+            <w:r>
+              <w:t xml:space="preserve">0</w:t>
+            </w:r>
+          </w:p>
+        </w:tc>
+        <w:tc>
+          <w:tcPr/>
+          <w:p>
+            <w:pPr>
+              <w:pStyle w:val="Compact"/>
+              <w:jc w:val="right"/>
+            </w:pPr>
+            <w:r>
+              <w:t xml:space="preserve">10</w:t>
+            </w:r>
+          </w:p>
+        </w:tc>
+        <w:tc>
+          <w:tcPr/>
+          <w:p>
+            <w:pPr>
+              <w:pStyle w:val="Compact"/>
+              <w:jc w:val="right"/>
+            </w:pPr>
+            <w:r>
+              <w:t xml:space="preserve">10</w:t>
+            </w:r>
+          </w:p>
+        </w:tc>
+      </w:tr>
+      <w:tr>
+        <w:tc>
+          <w:tcPr/>
+          <w:p>
+            <w:pPr>
+              <w:pStyle w:val="Compact"/>
+              <w:jc w:val="right"/>
+            </w:pPr>
+            <w:r>
+              <w:t xml:space="preserve">0.1</w:t>
+            </w:r>
+          </w:p>
+        </w:tc>
+        <w:tc>
+          <w:tcPr/>
+          <w:p>
+            <w:pPr>
+              <w:pStyle w:val="Compact"/>
+              <w:jc w:val="right"/>
+            </w:pPr>
+            <w:r>
+              <w:t xml:space="preserve">10.356</w:t>
+            </w:r>
+          </w:p>
+        </w:tc>
+        <w:tc>
+          <w:tcPr/>
+          <w:p>
+            <w:pPr>
+              <w:pStyle w:val="Compact"/>
+              <w:jc w:val="right"/>
+            </w:pPr>
+            <w:r>
+              <w:t xml:space="preserve">10.35</w:t>
+            </w:r>
+          </w:p>
+        </w:tc>
+      </w:tr>
+      <w:tr>
+        <w:tc>
+          <w:tcPr/>
+          <w:p>
+            <w:pPr>
+              <w:pStyle w:val="Compact"/>
+              <w:jc w:val="right"/>
+            </w:pPr>
+            <w:r>
+              <w:t xml:space="preserve">0.2</w:t>
+            </w:r>
+          </w:p>
+        </w:tc>
+        <w:tc>
+          <w:tcPr/>
+          <w:p>
+            <w:pPr>
+              <w:pStyle w:val="Compact"/>
+              <w:jc w:val="right"/>
+            </w:pPr>
+            <w:r>
+              <w:t xml:space="preserve">10.725</w:t>
+            </w:r>
+          </w:p>
+        </w:tc>
+        <w:tc>
+          <w:tcPr/>
+          <w:p>
+            <w:pPr>
+              <w:pStyle w:val="Compact"/>
+              <w:jc w:val="right"/>
+            </w:pPr>
+            <w:r>
+              <w:t xml:space="preserve">10.712</w:t>
+            </w:r>
+          </w:p>
+        </w:tc>
+      </w:tr>
+      <w:tr>
+        <w:tc>
+          <w:tcPr/>
+          <w:p>
+            <w:pPr>
+              <w:pStyle w:val="Compact"/>
+              <w:jc w:val="right"/>
+            </w:pPr>
+            <w:r>
+              <w:t xml:space="preserve">0.3</w:t>
+            </w:r>
+          </w:p>
+        </w:tc>
+        <w:tc>
+          <w:tcPr/>
+          <w:p>
+            <w:pPr>
+              <w:pStyle w:val="Compact"/>
+              <w:jc w:val="right"/>
+            </w:pPr>
+            <w:r>
+              <w:t xml:space="preserve">11.107</w:t>
+            </w:r>
+          </w:p>
+        </w:tc>
+        <w:tc>
+          <w:tcPr/>
+          <w:p>
+            <w:pPr>
+              <w:pStyle w:val="Compact"/>
+              <w:jc w:val="right"/>
+            </w:pPr>
+            <w:r>
+              <w:t xml:space="preserve">11.087</w:t>
+            </w:r>
+          </w:p>
+        </w:tc>
+      </w:tr>
+      <w:tr>
+        <w:tc>
+          <w:tcPr/>
+          <w:p>
+            <w:pPr>
+              <w:pStyle w:val="Compact"/>
+              <w:jc w:val="right"/>
+            </w:pPr>
+            <w:r>
+              <w:t xml:space="preserve">0.4</w:t>
+            </w:r>
+          </w:p>
+        </w:tc>
+        <w:tc>
+          <w:tcPr/>
+          <w:p>
+            <w:pPr>
+              <w:pStyle w:val="Compact"/>
+              <w:jc w:val="right"/>
+            </w:pPr>
+            <w:r>
+              <w:t xml:space="preserve">11.503</w:t>
+            </w:r>
+          </w:p>
+        </w:tc>
+        <w:tc>
+          <w:tcPr/>
+          <w:p>
+            <w:pPr>
+              <w:pStyle w:val="Compact"/>
+              <w:jc w:val="right"/>
+            </w:pPr>
+            <w:r>
+              <w:t xml:space="preserve">11.475</w:t>
+            </w:r>
+          </w:p>
+        </w:tc>
+      </w:tr>
+      <w:tr>
+        <w:tc>
+          <w:tcPr/>
+          <w:p>
+            <w:pPr>
+              <w:pStyle w:val="Compact"/>
+              <w:jc w:val="right"/>
+            </w:pPr>
+            <w:r>
+              <w:t xml:space="preserve">0.5</w:t>
+            </w:r>
+          </w:p>
+        </w:tc>
+        <w:tc>
+          <w:tcPr/>
+          <w:p>
+            <w:pPr>
+              <w:pStyle w:val="Compact"/>
+              <w:jc w:val="right"/>
+            </w:pPr>
+            <w:r>
+              <w:t xml:space="preserve">11.912</w:t>
+            </w:r>
+          </w:p>
+        </w:tc>
+        <w:tc>
+          <w:tcPr/>
+          <w:p>
+            <w:pPr>
+              <w:pStyle w:val="Compact"/>
+              <w:jc w:val="right"/>
+            </w:pPr>
+            <w:r>
+              <w:t xml:space="preserve">11.877</w:t>
+            </w:r>
+          </w:p>
+        </w:tc>
+      </w:tr>
+      <w:tr>
+        <w:tc>
+          <w:tcPr/>
+          <w:p>
+            <w:pPr>
+              <w:pStyle w:val="Compact"/>
+              <w:jc w:val="right"/>
+            </w:pPr>
+            <w:r>
+              <w:t xml:space="preserve">0.6</w:t>
+            </w:r>
+          </w:p>
+        </w:tc>
+        <w:tc>
+          <w:tcPr/>
+          <w:p>
+            <w:pPr>
+              <w:pStyle w:val="Compact"/>
+              <w:jc w:val="right"/>
+            </w:pPr>
+            <w:r>
+              <w:t xml:space="preserve">12.337</w:t>
+            </w:r>
+          </w:p>
+        </w:tc>
+        <w:tc>
+          <w:tcPr/>
+          <w:p>
+            <w:pPr>
+              <w:pStyle w:val="Compact"/>
+              <w:jc w:val="right"/>
+            </w:pPr>
+            <w:r>
+              <w:t xml:space="preserve">12.293</w:t>
+            </w:r>
+          </w:p>
+        </w:tc>
+      </w:tr>
+      <w:tr>
+        <w:tc>
+          <w:tcPr/>
+          <w:p>
+            <w:pPr>
+              <w:pStyle w:val="Compact"/>
+              <w:jc w:val="right"/>
+            </w:pPr>
+            <w:r>
+              <w:t xml:space="preserve">0.7</w:t>
+            </w:r>
+          </w:p>
+        </w:tc>
+        <w:tc>
+          <w:tcPr/>
+          <w:p>
+            <w:pPr>
+              <w:pStyle w:val="Compact"/>
+              <w:jc w:val="right"/>
+            </w:pPr>
+            <w:r>
+              <w:t xml:space="preserve">12.776</w:t>
+            </w:r>
+          </w:p>
+        </w:tc>
+        <w:tc>
+          <w:tcPr/>
+          <w:p>
+            <w:pPr>
+              <w:pStyle w:val="Compact"/>
+              <w:jc w:val="right"/>
+            </w:pPr>
+            <w:r>
+              <w:t xml:space="preserve">12.723</w:t>
+            </w:r>
+          </w:p>
+        </w:tc>
+      </w:tr>
+    </w:tbl>
+    <w:bookmarkEnd w:id="20"/>
+    <w:bookmarkStart w:id="21" w:name="сводная-таблица-основных-результатов"/>
+    <w:p>
+      <w:pPr>
+        <w:pStyle w:val="Heading3"/>
+      </w:pPr>
+      <w:r>
+        <w:t xml:space="preserve">Сводная таблица основных результатов</w:t>
       </w:r>
     </w:p>
     <w:tbl>
@@ -634,50 +1093,15 @@
         </w:tc>
       </w:tr>
     </w:tbl>
-    <w:bookmarkEnd w:id="18"/>
-    <w:bookmarkStart w:id="19" w:name="анализ-результатов"/>
+    <w:bookmarkEnd w:id="21"/>
+    <w:bookmarkEnd w:id="22"/>
+    <w:bookmarkStart w:id="23" w:name="анализ-и-интерпретация-результатов"/>
     <w:p>
       <w:pPr>
         <w:pStyle w:val="Heading2"/>
       </w:pPr>
       <w:r>
-        <w:t xml:space="preserve">Анализ результатов</w:t>
-      </w:r>
-    </w:p>
-    <w:p>
-      <w:pPr>
-        <w:pStyle w:val="FirstParagraph"/>
-      </w:pPr>
-      <w:r>
-        <w:t xml:space="preserve">Первый график отражает основную динамику исследуемой модели, а второй показывает чувствительность результата к изменению параметров. По полученным траекториям видно, что модель устойчиво воспроизводит ожидаемое качественное поведение системы и подходит для сравнительного анализа сценариев.</w:t>
-      </w:r>
-    </w:p>
-    <w:bookmarkEnd w:id="19"/>
-    <w:bookmarkStart w:id="20" w:name="выводы"/>
-    <w:p>
-      <w:pPr>
-        <w:pStyle w:val="Heading2"/>
-      </w:pPr>
-      <w:r>
-        <w:t xml:space="preserve">Выводы</w:t>
-      </w:r>
-    </w:p>
-    <w:p>
-      <w:pPr>
-        <w:pStyle w:val="FirstParagraph"/>
-      </w:pPr>
-      <w:r>
-        <w:t xml:space="preserve">В ходе выполнения лабораторной работы получен полный воспроизводимый комплект материалов: литературный источник, исполняемый код, ноутбук, отчёт, презентация и архив исходных данных. Единая автоматическая сборка позволяет быстро обновлять результаты после изменения параметров эксперимента.</w:t>
-      </w:r>
-    </w:p>
-    <w:bookmarkEnd w:id="20"/>
-    <w:bookmarkStart w:id="21" w:name="список-литературы"/>
-    <w:p>
-      <w:pPr>
-        <w:pStyle w:val="Heading2"/>
-      </w:pPr>
-      <w:r>
-        <w:t xml:space="preserve">Список литературы</w:t>
+        <w:t xml:space="preserve">Анализ и интерпретация результатов</w:t>
       </w:r>
     </w:p>
     <w:p>
@@ -685,15 +1109,1700 @@
         <w:pStyle w:val="Compact"/>
         <w:numPr>
           <w:ilvl w:val="0"/>
-          <w:numId w:val="1002"/>
+          <w:numId w:val="1004"/>
         </w:numPr>
       </w:pPr>
       <w:r>
+        <w:t xml:space="preserve">Сравнение аналитической траектории и схемы Эйлера показывает, что при небольшом шаге интегрирования численное решение воспроизводит форму точного решения и отклоняется постепенно по мере роста времени.</w:t>
+      </w:r>
+    </w:p>
+    <w:p>
+      <w:pPr>
+        <w:pStyle w:val="Compact"/>
+        <w:numPr>
+          <w:ilvl w:val="0"/>
+          <w:numId w:val="1004"/>
+        </w:numPr>
+      </w:pPr>
+      <w:r>
+        <w:t xml:space="preserve">С ростом коэффициента alpha кривая становится более крутой, а максимальное значение модели на фиксированном интервале быстро увеличивается. Это демонстрирует высокую чувствительность экспоненциальной модели к изменению параметров.</w:t>
+      </w:r>
+    </w:p>
+    <w:p>
+      <w:pPr>
+        <w:pStyle w:val="Compact"/>
+        <w:numPr>
+          <w:ilvl w:val="0"/>
+          <w:numId w:val="1004"/>
+        </w:numPr>
+      </w:pPr>
+      <w:r>
+        <w:t xml:space="preserve">Лабораторная работа служит базой для последующих более сложных моделей, где уже используются нелинейные взаимодействия, ограничение ресурсов или стохастические эффекты.</w:t>
+      </w:r>
+    </w:p>
+    <w:bookmarkEnd w:id="23"/>
+    <w:bookmarkStart w:id="24" w:name="выводы"/>
+    <w:p>
+      <w:pPr>
+        <w:pStyle w:val="Heading2"/>
+      </w:pPr>
+      <w:r>
+        <w:t xml:space="preserve">Выводы</w:t>
+      </w:r>
+    </w:p>
+    <w:p>
+      <w:pPr>
+        <w:pStyle w:val="Compact"/>
+        <w:numPr>
+          <w:ilvl w:val="0"/>
+          <w:numId w:val="1005"/>
+        </w:numPr>
+      </w:pPr>
+      <w:r>
+        <w:t xml:space="preserve">Построена и исследована базовая модель экспоненциального роста.</w:t>
+      </w:r>
+    </w:p>
+    <w:p>
+      <w:pPr>
+        <w:pStyle w:val="Compact"/>
+        <w:numPr>
+          <w:ilvl w:val="0"/>
+          <w:numId w:val="1005"/>
+        </w:numPr>
+      </w:pPr>
+      <w:r>
+        <w:t xml:space="preserve">Показано различие между аналитическим решением и численным приближением методом Эйлера.</w:t>
+      </w:r>
+    </w:p>
+    <w:p>
+      <w:pPr>
+        <w:pStyle w:val="Compact"/>
+        <w:numPr>
+          <w:ilvl w:val="0"/>
+          <w:numId w:val="1005"/>
+        </w:numPr>
+      </w:pPr>
+      <w:r>
+        <w:t xml:space="preserve">Подтверждено, что изменение коэффициента роста существенно влияет на скорость развития процесса.</w:t>
+      </w:r>
+    </w:p>
+    <w:bookmarkEnd w:id="24"/>
+    <w:bookmarkStart w:id="25" w:name="листинг-программы"/>
+    <w:p>
+      <w:pPr>
+        <w:pStyle w:val="Heading2"/>
+      </w:pPr>
+      <w:r>
+        <w:t xml:space="preserve">Листинг программы</w:t>
+      </w:r>
+    </w:p>
+    <w:p>
+      <w:pPr>
+        <w:pStyle w:val="SourceCode"/>
+      </w:pPr>
+      <w:r>
+        <w:rPr>
+          <w:rStyle w:val="CommentTok"/>
+        </w:rPr>
+        <w:t xml:space="preserve"># Этот файл сгенерирован автоматически из qmd-источника.</w:t>
+      </w:r>
+      <w:r>
+        <w:br/>
+      </w:r>
+      <w:r>
+        <w:br/>
+      </w:r>
+      <w:r>
+        <w:rPr>
+          <w:rStyle w:val="ImportTok"/>
+        </w:rPr>
+        <w:t xml:space="preserve">using</w:t>
+      </w:r>
+      <w:r>
+        <w:rPr>
+          <w:rStyle w:val="NormalTok"/>
+        </w:rPr>
+        <w:t xml:space="preserve"> </w:t>
+      </w:r>
+      <w:r>
+        <w:rPr>
+          <w:rStyle w:val="BuiltInTok"/>
+        </w:rPr>
+        <w:t xml:space="preserve">DelimitedFiles</w:t>
+      </w:r>
+      <w:r>
+        <w:br/>
+      </w:r>
+      <w:r>
+        <w:rPr>
+          <w:rStyle w:val="ImportTok"/>
+        </w:rPr>
+        <w:t xml:space="preserve">using</w:t>
+      </w:r>
+      <w:r>
+        <w:rPr>
+          <w:rStyle w:val="NormalTok"/>
+        </w:rPr>
+        <w:t xml:space="preserve"> </w:t>
+      </w:r>
+      <w:r>
+        <w:rPr>
+          <w:rStyle w:val="BuiltInTok"/>
+        </w:rPr>
+        <w:t xml:space="preserve">Printf</w:t>
+      </w:r>
+      <w:r>
+        <w:br/>
+      </w:r>
+      <w:r>
+        <w:br/>
+      </w:r>
+      <w:r>
+        <w:rPr>
+          <w:rStyle w:val="NormalTok"/>
+        </w:rPr>
+        <w:t xml:space="preserve">results_dir </w:t>
+      </w:r>
+      <w:r>
+        <w:rPr>
+          <w:rStyle w:val="OperatorTok"/>
+        </w:rPr>
+        <w:t xml:space="preserve">=</w:t>
+      </w:r>
+      <w:r>
+        <w:rPr>
+          <w:rStyle w:val="NormalTok"/>
+        </w:rPr>
+        <w:t xml:space="preserve"> </w:t>
+      </w:r>
+      <w:r>
+        <w:rPr>
+          <w:rStyle w:val="FunctionTok"/>
+        </w:rPr>
+        <w:t xml:space="preserve">normpath</w:t>
+      </w:r>
+      <w:r>
+        <w:rPr>
+          <w:rStyle w:val="NormalTok"/>
+        </w:rPr>
+        <w:t xml:space="preserve">(</w:t>
+      </w:r>
+      <w:r>
+        <w:rPr>
+          <w:rStyle w:val="FunctionTok"/>
+        </w:rPr>
+        <w:t xml:space="preserve">joinpath</w:t>
+      </w:r>
+      <w:r>
+        <w:rPr>
+          <w:rStyle w:val="NormalTok"/>
+        </w:rPr>
+        <w:t xml:space="preserve">(</w:t>
+      </w:r>
+      <w:r>
+        <w:rPr>
+          <w:rStyle w:val="PreprocessorTok"/>
+        </w:rPr>
+        <w:t xml:space="preserve">@__DIR__</w:t>
+      </w:r>
+      <w:r>
+        <w:rPr>
+          <w:rStyle w:val="NormalTok"/>
+        </w:rPr>
+        <w:t xml:space="preserve">, </w:t>
+      </w:r>
+      <w:r>
+        <w:rPr>
+          <w:rStyle w:val="StringTok"/>
+        </w:rPr>
+        <w:t xml:space="preserve">".."</w:t>
+      </w:r>
+      <w:r>
+        <w:rPr>
+          <w:rStyle w:val="NormalTok"/>
+        </w:rPr>
+        <w:t xml:space="preserve">, </w:t>
+      </w:r>
+      <w:r>
+        <w:rPr>
+          <w:rStyle w:val="StringTok"/>
+        </w:rPr>
+        <w:t xml:space="preserve">"results"</w:t>
+      </w:r>
+      <w:r>
+        <w:rPr>
+          <w:rStyle w:val="NormalTok"/>
+        </w:rPr>
+        <w:t xml:space="preserve">, </w:t>
+      </w:r>
+      <w:r>
+        <w:rPr>
+          <w:rStyle w:val="StringTok"/>
+        </w:rPr>
+        <w:t xml:space="preserve">"data"</w:t>
+      </w:r>
+      <w:r>
+        <w:rPr>
+          <w:rStyle w:val="NormalTok"/>
+        </w:rPr>
+        <w:t xml:space="preserve">))</w:t>
+      </w:r>
+      <w:r>
+        <w:br/>
+      </w:r>
+      <w:r>
+        <w:rPr>
+          <w:rStyle w:val="FunctionTok"/>
+        </w:rPr>
+        <w:t xml:space="preserve">mkpath</w:t>
+      </w:r>
+      <w:r>
+        <w:rPr>
+          <w:rStyle w:val="NormalTok"/>
+        </w:rPr>
+        <w:t xml:space="preserve">(results_dir)</w:t>
+      </w:r>
+      <w:r>
+        <w:br/>
+      </w:r>
+      <w:r>
+        <w:br/>
+      </w:r>
+      <w:r>
+        <w:rPr>
+          <w:rStyle w:val="KeywordTok"/>
+        </w:rPr>
+        <w:t xml:space="preserve">function</w:t>
+      </w:r>
+      <w:r>
+        <w:rPr>
+          <w:rStyle w:val="NormalTok"/>
+        </w:rPr>
+        <w:t xml:space="preserve"> </w:t>
+      </w:r>
+      <w:r>
+        <w:rPr>
+          <w:rStyle w:val="FunctionTok"/>
+        </w:rPr>
+        <w:t xml:space="preserve">write_csv</w:t>
+      </w:r>
+      <w:r>
+        <w:rPr>
+          <w:rStyle w:val="NormalTok"/>
+        </w:rPr>
+        <w:t xml:space="preserve">(path, headers, rows)</w:t>
+      </w:r>
+      <w:r>
+        <w:br/>
+      </w:r>
+      <w:r>
+        <w:rPr>
+          <w:rStyle w:val="NormalTok"/>
+        </w:rPr>
+        <w:t xml:space="preserve">    </w:t>
+      </w:r>
+      <w:r>
+        <w:rPr>
+          <w:rStyle w:val="FunctionTok"/>
+        </w:rPr>
+        <w:t xml:space="preserve">open</w:t>
+      </w:r>
+      <w:r>
+        <w:rPr>
+          <w:rStyle w:val="NormalTok"/>
+        </w:rPr>
+        <w:t xml:space="preserve">(path, </w:t>
+      </w:r>
+      <w:r>
+        <w:rPr>
+          <w:rStyle w:val="StringTok"/>
+        </w:rPr>
+        <w:t xml:space="preserve">"w"</w:t>
+      </w:r>
+      <w:r>
+        <w:rPr>
+          <w:rStyle w:val="NormalTok"/>
+        </w:rPr>
+        <w:t xml:space="preserve">) </w:t>
+      </w:r>
+      <w:r>
+        <w:rPr>
+          <w:rStyle w:val="ControlFlowTok"/>
+        </w:rPr>
+        <w:t xml:space="preserve">do</w:t>
+      </w:r>
+      <w:r>
+        <w:rPr>
+          <w:rStyle w:val="NormalTok"/>
+        </w:rPr>
+        <w:t xml:space="preserve"> io</w:t>
+      </w:r>
+      <w:r>
+        <w:br/>
+      </w:r>
+      <w:r>
+        <w:rPr>
+          <w:rStyle w:val="NormalTok"/>
+        </w:rPr>
+        <w:t xml:space="preserve">        </w:t>
+      </w:r>
+      <w:r>
+        <w:rPr>
+          <w:rStyle w:val="FunctionTok"/>
+        </w:rPr>
+        <w:t xml:space="preserve">println</w:t>
+      </w:r>
+      <w:r>
+        <w:rPr>
+          <w:rStyle w:val="NormalTok"/>
+        </w:rPr>
+        <w:t xml:space="preserve">(io, </w:t>
+      </w:r>
+      <w:r>
+        <w:rPr>
+          <w:rStyle w:val="FunctionTok"/>
+        </w:rPr>
+        <w:t xml:space="preserve">join</w:t>
+      </w:r>
+      <w:r>
+        <w:rPr>
+          <w:rStyle w:val="NormalTok"/>
+        </w:rPr>
+        <w:t xml:space="preserve">(headers, </w:t>
+      </w:r>
+      <w:r>
+        <w:rPr>
+          <w:rStyle w:val="StringTok"/>
+        </w:rPr>
+        <w:t xml:space="preserve">","</w:t>
+      </w:r>
+      <w:r>
+        <w:rPr>
+          <w:rStyle w:val="NormalTok"/>
+        </w:rPr>
+        <w:t xml:space="preserve">))</w:t>
+      </w:r>
+      <w:r>
+        <w:br/>
+      </w:r>
+      <w:r>
+        <w:rPr>
+          <w:rStyle w:val="NormalTok"/>
+        </w:rPr>
+        <w:t xml:space="preserve">        </w:t>
+      </w:r>
+      <w:r>
+        <w:rPr>
+          <w:rStyle w:val="ControlFlowTok"/>
+        </w:rPr>
+        <w:t xml:space="preserve">for</w:t>
+      </w:r>
+      <w:r>
+        <w:rPr>
+          <w:rStyle w:val="NormalTok"/>
+        </w:rPr>
+        <w:t xml:space="preserve"> row </w:t>
+      </w:r>
+      <w:r>
+        <w:rPr>
+          <w:rStyle w:val="KeywordTok"/>
+        </w:rPr>
+        <w:t xml:space="preserve">in</w:t>
+      </w:r>
+      <w:r>
+        <w:rPr>
+          <w:rStyle w:val="NormalTok"/>
+        </w:rPr>
+        <w:t xml:space="preserve"> rows</w:t>
+      </w:r>
+      <w:r>
+        <w:br/>
+      </w:r>
+      <w:r>
+        <w:rPr>
+          <w:rStyle w:val="NormalTok"/>
+        </w:rPr>
+        <w:t xml:space="preserve">            </w:t>
+      </w:r>
+      <w:r>
+        <w:rPr>
+          <w:rStyle w:val="FunctionTok"/>
+        </w:rPr>
+        <w:t xml:space="preserve">println</w:t>
+      </w:r>
+      <w:r>
+        <w:rPr>
+          <w:rStyle w:val="NormalTok"/>
+        </w:rPr>
+        <w:t xml:space="preserve">(io, </w:t>
+      </w:r>
+      <w:r>
+        <w:rPr>
+          <w:rStyle w:val="FunctionTok"/>
+        </w:rPr>
+        <w:t xml:space="preserve">join</w:t>
+      </w:r>
+      <w:r>
+        <w:rPr>
+          <w:rStyle w:val="NormalTok"/>
+        </w:rPr>
+        <w:t xml:space="preserve">(</w:t>
+      </w:r>
+      <w:r>
+        <w:rPr>
+          <w:rStyle w:val="FunctionTok"/>
+        </w:rPr>
+        <w:t xml:space="preserve">string</w:t>
+      </w:r>
+      <w:r>
+        <w:rPr>
+          <w:rStyle w:val="NormalTok"/>
+        </w:rPr>
+        <w:t xml:space="preserve">.(row), </w:t>
+      </w:r>
+      <w:r>
+        <w:rPr>
+          <w:rStyle w:val="StringTok"/>
+        </w:rPr>
+        <w:t xml:space="preserve">","</w:t>
+      </w:r>
+      <w:r>
+        <w:rPr>
+          <w:rStyle w:val="NormalTok"/>
+        </w:rPr>
+        <w:t xml:space="preserve">))</w:t>
+      </w:r>
+      <w:r>
+        <w:br/>
+      </w:r>
+      <w:r>
+        <w:rPr>
+          <w:rStyle w:val="NormalTok"/>
+        </w:rPr>
+        <w:t xml:space="preserve">        </w:t>
+      </w:r>
+      <w:r>
+        <w:rPr>
+          <w:rStyle w:val="ControlFlowTok"/>
+        </w:rPr>
+        <w:t xml:space="preserve">end</w:t>
+      </w:r>
+      <w:r>
+        <w:br/>
+      </w:r>
+      <w:r>
+        <w:rPr>
+          <w:rStyle w:val="NormalTok"/>
+        </w:rPr>
+        <w:t xml:space="preserve">    </w:t>
+      </w:r>
+      <w:r>
+        <w:rPr>
+          <w:rStyle w:val="ControlFlowTok"/>
+        </w:rPr>
+        <w:t xml:space="preserve">end</w:t>
+      </w:r>
+      <w:r>
+        <w:br/>
+      </w:r>
+      <w:r>
+        <w:rPr>
+          <w:rStyle w:val="KeywordTok"/>
+        </w:rPr>
+        <w:t xml:space="preserve">end</w:t>
+      </w:r>
+      <w:r>
+        <w:br/>
+      </w:r>
+      <w:r>
+        <w:br/>
+      </w:r>
+      <w:r>
+        <w:rPr>
+          <w:rStyle w:val="NormalTok"/>
+        </w:rPr>
+        <w:t xml:space="preserve">u0 </w:t>
+      </w:r>
+      <w:r>
+        <w:rPr>
+          <w:rStyle w:val="OperatorTok"/>
+        </w:rPr>
+        <w:t xml:space="preserve">=</w:t>
+      </w:r>
+      <w:r>
+        <w:rPr>
+          <w:rStyle w:val="NormalTok"/>
+        </w:rPr>
+        <w:t xml:space="preserve"> </w:t>
+      </w:r>
+      <w:r>
+        <w:rPr>
+          <w:rStyle w:val="FloatTok"/>
+        </w:rPr>
+        <w:t xml:space="preserve">10.0</w:t>
+      </w:r>
+      <w:r>
+        <w:br/>
+      </w:r>
+      <w:r>
+        <w:rPr>
+          <w:rStyle w:val="NormalTok"/>
+        </w:rPr>
+        <w:t xml:space="preserve">alpha </w:t>
+      </w:r>
+      <w:r>
+        <w:rPr>
+          <w:rStyle w:val="OperatorTok"/>
+        </w:rPr>
+        <w:t xml:space="preserve">=</w:t>
+      </w:r>
+      <w:r>
+        <w:rPr>
+          <w:rStyle w:val="NormalTok"/>
+        </w:rPr>
+        <w:t xml:space="preserve"> </w:t>
+      </w:r>
+      <w:r>
+        <w:rPr>
+          <w:rStyle w:val="FloatTok"/>
+        </w:rPr>
+        <w:t xml:space="preserve">0.35</w:t>
+      </w:r>
+      <w:r>
+        <w:br/>
+      </w:r>
+      <w:r>
+        <w:rPr>
+          <w:rStyle w:val="NormalTok"/>
+        </w:rPr>
+        <w:t xml:space="preserve">t_max </w:t>
+      </w:r>
+      <w:r>
+        <w:rPr>
+          <w:rStyle w:val="OperatorTok"/>
+        </w:rPr>
+        <w:t xml:space="preserve">=</w:t>
+      </w:r>
+      <w:r>
+        <w:rPr>
+          <w:rStyle w:val="NormalTok"/>
+        </w:rPr>
+        <w:t xml:space="preserve"> </w:t>
+      </w:r>
+      <w:r>
+        <w:rPr>
+          <w:rStyle w:val="FloatTok"/>
+        </w:rPr>
+        <w:t xml:space="preserve">12.0</w:t>
+      </w:r>
+      <w:r>
+        <w:br/>
+      </w:r>
+      <w:r>
+        <w:rPr>
+          <w:rStyle w:val="NormalTok"/>
+        </w:rPr>
+        <w:t xml:space="preserve">dt </w:t>
+      </w:r>
+      <w:r>
+        <w:rPr>
+          <w:rStyle w:val="OperatorTok"/>
+        </w:rPr>
+        <w:t xml:space="preserve">=</w:t>
+      </w:r>
+      <w:r>
+        <w:rPr>
+          <w:rStyle w:val="NormalTok"/>
+        </w:rPr>
+        <w:t xml:space="preserve"> </w:t>
+      </w:r>
+      <w:r>
+        <w:rPr>
+          <w:rStyle w:val="FloatTok"/>
+        </w:rPr>
+        <w:t xml:space="preserve">0.1</w:t>
+      </w:r>
+      <w:r>
+        <w:br/>
+      </w:r>
+      <w:r>
+        <w:rPr>
+          <w:rStyle w:val="NormalTok"/>
+        </w:rPr>
+        <w:t xml:space="preserve">steps </w:t>
+      </w:r>
+      <w:r>
+        <w:rPr>
+          <w:rStyle w:val="OperatorTok"/>
+        </w:rPr>
+        <w:t xml:space="preserve">=</w:t>
+      </w:r>
+      <w:r>
+        <w:rPr>
+          <w:rStyle w:val="NormalTok"/>
+        </w:rPr>
+        <w:t xml:space="preserve"> </w:t>
+      </w:r>
+      <w:r>
+        <w:rPr>
+          <w:rStyle w:val="FunctionTok"/>
+        </w:rPr>
+        <w:t xml:space="preserve">Int</w:t>
+      </w:r>
+      <w:r>
+        <w:rPr>
+          <w:rStyle w:val="NormalTok"/>
+        </w:rPr>
+        <w:t xml:space="preserve">(</w:t>
+      </w:r>
+      <w:r>
+        <w:rPr>
+          <w:rStyle w:val="FunctionTok"/>
+        </w:rPr>
+        <w:t xml:space="preserve">round</w:t>
+      </w:r>
+      <w:r>
+        <w:rPr>
+          <w:rStyle w:val="NormalTok"/>
+        </w:rPr>
+        <w:t xml:space="preserve">(t_max </w:t>
+      </w:r>
+      <w:r>
+        <w:rPr>
+          <w:rStyle w:val="OperatorTok"/>
+        </w:rPr>
+        <w:t xml:space="preserve">/</w:t>
+      </w:r>
+      <w:r>
+        <w:rPr>
+          <w:rStyle w:val="NormalTok"/>
+        </w:rPr>
+        <w:t xml:space="preserve"> dt))</w:t>
+      </w:r>
+      <w:r>
+        <w:br/>
+      </w:r>
+      <w:r>
+        <w:br/>
+      </w:r>
+      <w:r>
+        <w:rPr>
+          <w:rStyle w:val="NormalTok"/>
+        </w:rPr>
+        <w:t xml:space="preserve">time </w:t>
+      </w:r>
+      <w:r>
+        <w:rPr>
+          <w:rStyle w:val="OperatorTok"/>
+        </w:rPr>
+        <w:t xml:space="preserve">=</w:t>
+      </w:r>
+      <w:r>
+        <w:rPr>
+          <w:rStyle w:val="NormalTok"/>
+        </w:rPr>
+        <w:t xml:space="preserve"> [i </w:t>
+      </w:r>
+      <w:r>
+        <w:rPr>
+          <w:rStyle w:val="OperatorTok"/>
+        </w:rPr>
+        <w:t xml:space="preserve">*</w:t>
+      </w:r>
+      <w:r>
+        <w:rPr>
+          <w:rStyle w:val="NormalTok"/>
+        </w:rPr>
+        <w:t xml:space="preserve"> dt for i </w:t>
+      </w:r>
+      <w:r>
+        <w:rPr>
+          <w:rStyle w:val="KeywordTok"/>
+        </w:rPr>
+        <w:t xml:space="preserve">in</w:t>
+      </w:r>
+      <w:r>
+        <w:rPr>
+          <w:rStyle w:val="NormalTok"/>
+        </w:rPr>
+        <w:t xml:space="preserve"> </w:t>
+      </w:r>
+      <w:r>
+        <w:rPr>
+          <w:rStyle w:val="FloatTok"/>
+        </w:rPr>
+        <w:t xml:space="preserve">0</w:t>
+      </w:r>
+      <w:r>
+        <w:rPr>
+          <w:rStyle w:val="OperatorTok"/>
+        </w:rPr>
+        <w:t xml:space="preserve">:</w:t>
+      </w:r>
+      <w:r>
+        <w:rPr>
+          <w:rStyle w:val="NormalTok"/>
+        </w:rPr>
+        <w:t xml:space="preserve">steps]</w:t>
+      </w:r>
+      <w:r>
+        <w:br/>
+      </w:r>
+      <w:r>
+        <w:rPr>
+          <w:rStyle w:val="NormalTok"/>
+        </w:rPr>
+        <w:t xml:space="preserve">analytic </w:t>
+      </w:r>
+      <w:r>
+        <w:rPr>
+          <w:rStyle w:val="OperatorTok"/>
+        </w:rPr>
+        <w:t xml:space="preserve">=</w:t>
+      </w:r>
+      <w:r>
+        <w:rPr>
+          <w:rStyle w:val="NormalTok"/>
+        </w:rPr>
+        <w:t xml:space="preserve"> [u0 </w:t>
+      </w:r>
+      <w:r>
+        <w:rPr>
+          <w:rStyle w:val="OperatorTok"/>
+        </w:rPr>
+        <w:t xml:space="preserve">*</w:t>
+      </w:r>
+      <w:r>
+        <w:rPr>
+          <w:rStyle w:val="NormalTok"/>
+        </w:rPr>
+        <w:t xml:space="preserve"> </w:t>
+      </w:r>
+      <w:r>
+        <w:rPr>
+          <w:rStyle w:val="FunctionTok"/>
+        </w:rPr>
+        <w:t xml:space="preserve">exp</w:t>
+      </w:r>
+      <w:r>
+        <w:rPr>
+          <w:rStyle w:val="NormalTok"/>
+        </w:rPr>
+        <w:t xml:space="preserve">(alpha </w:t>
+      </w:r>
+      <w:r>
+        <w:rPr>
+          <w:rStyle w:val="OperatorTok"/>
+        </w:rPr>
+        <w:t xml:space="preserve">*</w:t>
+      </w:r>
+      <w:r>
+        <w:rPr>
+          <w:rStyle w:val="NormalTok"/>
+        </w:rPr>
+        <w:t xml:space="preserve"> t) for t </w:t>
+      </w:r>
+      <w:r>
+        <w:rPr>
+          <w:rStyle w:val="KeywordTok"/>
+        </w:rPr>
+        <w:t xml:space="preserve">in</w:t>
+      </w:r>
+      <w:r>
+        <w:rPr>
+          <w:rStyle w:val="NormalTok"/>
+        </w:rPr>
+        <w:t xml:space="preserve"> time]</w:t>
+      </w:r>
+      <w:r>
+        <w:br/>
+      </w:r>
+      <w:r>
+        <w:rPr>
+          <w:rStyle w:val="NormalTok"/>
+        </w:rPr>
+        <w:t xml:space="preserve">euler </w:t>
+      </w:r>
+      <w:r>
+        <w:rPr>
+          <w:rStyle w:val="OperatorTok"/>
+        </w:rPr>
+        <w:t xml:space="preserve">=</w:t>
+      </w:r>
+      <w:r>
+        <w:rPr>
+          <w:rStyle w:val="NormalTok"/>
+        </w:rPr>
+        <w:t xml:space="preserve"> </w:t>
+      </w:r>
+      <w:r>
+        <w:rPr>
+          <w:rStyle w:val="FunctionTok"/>
+        </w:rPr>
+        <w:t xml:space="preserve">zeros</w:t>
+      </w:r>
+      <w:r>
+        <w:rPr>
+          <w:rStyle w:val="NormalTok"/>
+        </w:rPr>
+        <w:t xml:space="preserve">(</w:t>
+      </w:r>
+      <w:r>
+        <w:rPr>
+          <w:rStyle w:val="FunctionTok"/>
+        </w:rPr>
+        <w:t xml:space="preserve">length</w:t>
+      </w:r>
+      <w:r>
+        <w:rPr>
+          <w:rStyle w:val="NormalTok"/>
+        </w:rPr>
+        <w:t xml:space="preserve">(time))</w:t>
+      </w:r>
+      <w:r>
+        <w:br/>
+      </w:r>
+      <w:r>
+        <w:rPr>
+          <w:rStyle w:val="NormalTok"/>
+        </w:rPr>
+        <w:t xml:space="preserve">euler[</w:t>
+      </w:r>
+      <w:r>
+        <w:rPr>
+          <w:rStyle w:val="FloatTok"/>
+        </w:rPr>
+        <w:t xml:space="preserve">1</w:t>
+      </w:r>
+      <w:r>
+        <w:rPr>
+          <w:rStyle w:val="NormalTok"/>
+        </w:rPr>
+        <w:t xml:space="preserve">] </w:t>
+      </w:r>
+      <w:r>
+        <w:rPr>
+          <w:rStyle w:val="OperatorTok"/>
+        </w:rPr>
+        <w:t xml:space="preserve">=</w:t>
+      </w:r>
+      <w:r>
+        <w:rPr>
+          <w:rStyle w:val="NormalTok"/>
+        </w:rPr>
+        <w:t xml:space="preserve"> u0</w:t>
+      </w:r>
+      <w:r>
+        <w:br/>
+      </w:r>
+      <w:r>
+        <w:rPr>
+          <w:rStyle w:val="ControlFlowTok"/>
+        </w:rPr>
+        <w:t xml:space="preserve">for</w:t>
+      </w:r>
+      <w:r>
+        <w:rPr>
+          <w:rStyle w:val="NormalTok"/>
+        </w:rPr>
+        <w:t xml:space="preserve"> i </w:t>
+      </w:r>
+      <w:r>
+        <w:rPr>
+          <w:rStyle w:val="KeywordTok"/>
+        </w:rPr>
+        <w:t xml:space="preserve">in</w:t>
+      </w:r>
+      <w:r>
+        <w:rPr>
+          <w:rStyle w:val="NormalTok"/>
+        </w:rPr>
+        <w:t xml:space="preserve"> </w:t>
+      </w:r>
+      <w:r>
+        <w:rPr>
+          <w:rStyle w:val="FloatTok"/>
+        </w:rPr>
+        <w:t xml:space="preserve">2</w:t>
+      </w:r>
+      <w:r>
+        <w:rPr>
+          <w:rStyle w:val="OperatorTok"/>
+        </w:rPr>
+        <w:t xml:space="preserve">:</w:t>
+      </w:r>
+      <w:r>
+        <w:rPr>
+          <w:rStyle w:val="FunctionTok"/>
+        </w:rPr>
+        <w:t xml:space="preserve">length</w:t>
+      </w:r>
+      <w:r>
+        <w:rPr>
+          <w:rStyle w:val="NormalTok"/>
+        </w:rPr>
+        <w:t xml:space="preserve">(time)</w:t>
+      </w:r>
+      <w:r>
+        <w:br/>
+      </w:r>
+      <w:r>
+        <w:rPr>
+          <w:rStyle w:val="NormalTok"/>
+        </w:rPr>
+        <w:t xml:space="preserve">    euler[i] </w:t>
+      </w:r>
+      <w:r>
+        <w:rPr>
+          <w:rStyle w:val="OperatorTok"/>
+        </w:rPr>
+        <w:t xml:space="preserve">=</w:t>
+      </w:r>
+      <w:r>
+        <w:rPr>
+          <w:rStyle w:val="NormalTok"/>
+        </w:rPr>
+        <w:t xml:space="preserve"> euler[i </w:t>
+      </w:r>
+      <w:r>
+        <w:rPr>
+          <w:rStyle w:val="OperatorTok"/>
+        </w:rPr>
+        <w:t xml:space="preserve">-</w:t>
+      </w:r>
+      <w:r>
+        <w:rPr>
+          <w:rStyle w:val="NormalTok"/>
+        </w:rPr>
+        <w:t xml:space="preserve"> </w:t>
+      </w:r>
+      <w:r>
+        <w:rPr>
+          <w:rStyle w:val="FloatTok"/>
+        </w:rPr>
+        <w:t xml:space="preserve">1</w:t>
+      </w:r>
+      <w:r>
+        <w:rPr>
+          <w:rStyle w:val="NormalTok"/>
+        </w:rPr>
+        <w:t xml:space="preserve">] </w:t>
+      </w:r>
+      <w:r>
+        <w:rPr>
+          <w:rStyle w:val="OperatorTok"/>
+        </w:rPr>
+        <w:t xml:space="preserve">+</w:t>
+      </w:r>
+      <w:r>
+        <w:rPr>
+          <w:rStyle w:val="NormalTok"/>
+        </w:rPr>
+        <w:t xml:space="preserve"> dt </w:t>
+      </w:r>
+      <w:r>
+        <w:rPr>
+          <w:rStyle w:val="OperatorTok"/>
+        </w:rPr>
+        <w:t xml:space="preserve">*</w:t>
+      </w:r>
+      <w:r>
+        <w:rPr>
+          <w:rStyle w:val="NormalTok"/>
+        </w:rPr>
+        <w:t xml:space="preserve"> alpha </w:t>
+      </w:r>
+      <w:r>
+        <w:rPr>
+          <w:rStyle w:val="OperatorTok"/>
+        </w:rPr>
+        <w:t xml:space="preserve">*</w:t>
+      </w:r>
+      <w:r>
+        <w:rPr>
+          <w:rStyle w:val="NormalTok"/>
+        </w:rPr>
+        <w:t xml:space="preserve"> euler[i </w:t>
+      </w:r>
+      <w:r>
+        <w:rPr>
+          <w:rStyle w:val="OperatorTok"/>
+        </w:rPr>
+        <w:t xml:space="preserve">-</w:t>
+      </w:r>
+      <w:r>
+        <w:rPr>
+          <w:rStyle w:val="NormalTok"/>
+        </w:rPr>
+        <w:t xml:space="preserve"> </w:t>
+      </w:r>
+      <w:r>
+        <w:rPr>
+          <w:rStyle w:val="FloatTok"/>
+        </w:rPr>
+        <w:t xml:space="preserve">1</w:t>
+      </w:r>
+      <w:r>
+        <w:rPr>
+          <w:rStyle w:val="NormalTok"/>
+        </w:rPr>
+        <w:t xml:space="preserve">]</w:t>
+      </w:r>
+      <w:r>
+        <w:br/>
+      </w:r>
+      <w:r>
+        <w:rPr>
+          <w:rStyle w:val="ControlFlowTok"/>
+        </w:rPr>
+        <w:t xml:space="preserve">end</w:t>
+      </w:r>
+      <w:r>
+        <w:br/>
+      </w:r>
+      <w:r>
+        <w:br/>
+      </w:r>
+      <w:r>
+        <w:rPr>
+          <w:rStyle w:val="NormalTok"/>
+        </w:rPr>
+        <w:t xml:space="preserve">rows </w:t>
+      </w:r>
+      <w:r>
+        <w:rPr>
+          <w:rStyle w:val="OperatorTok"/>
+        </w:rPr>
+        <w:t xml:space="preserve">=</w:t>
+      </w:r>
+      <w:r>
+        <w:rPr>
+          <w:rStyle w:val="NormalTok"/>
+        </w:rPr>
+        <w:t xml:space="preserve"> [[</w:t>
+      </w:r>
+      <w:r>
+        <w:rPr>
+          <w:rStyle w:val="PreprocessorTok"/>
+        </w:rPr>
+        <w:t xml:space="preserve">@sprintf</w:t>
+      </w:r>
+      <w:r>
+        <w:rPr>
+          <w:rStyle w:val="NormalTok"/>
+        </w:rPr>
+        <w:t xml:space="preserve">(</w:t>
+      </w:r>
+      <w:r>
+        <w:rPr>
+          <w:rStyle w:val="StringTok"/>
+        </w:rPr>
+        <w:t xml:space="preserve">"%.3f"</w:t>
+      </w:r>
+      <w:r>
+        <w:rPr>
+          <w:rStyle w:val="NormalTok"/>
+        </w:rPr>
+        <w:t xml:space="preserve">, time[i]), </w:t>
+      </w:r>
+      <w:r>
+        <w:rPr>
+          <w:rStyle w:val="PreprocessorTok"/>
+        </w:rPr>
+        <w:t xml:space="preserve">@sprintf</w:t>
+      </w:r>
+      <w:r>
+        <w:rPr>
+          <w:rStyle w:val="NormalTok"/>
+        </w:rPr>
+        <w:t xml:space="preserve">(</w:t>
+      </w:r>
+      <w:r>
+        <w:rPr>
+          <w:rStyle w:val="StringTok"/>
+        </w:rPr>
+        <w:t xml:space="preserve">"%.6f"</w:t>
+      </w:r>
+      <w:r>
+        <w:rPr>
+          <w:rStyle w:val="NormalTok"/>
+        </w:rPr>
+        <w:t xml:space="preserve">, analytic[i]), </w:t>
+      </w:r>
+      <w:r>
+        <w:rPr>
+          <w:rStyle w:val="PreprocessorTok"/>
+        </w:rPr>
+        <w:t xml:space="preserve">@sprintf</w:t>
+      </w:r>
+      <w:r>
+        <w:rPr>
+          <w:rStyle w:val="NormalTok"/>
+        </w:rPr>
+        <w:t xml:space="preserve">(</w:t>
+      </w:r>
+      <w:r>
+        <w:rPr>
+          <w:rStyle w:val="StringTok"/>
+        </w:rPr>
+        <w:t xml:space="preserve">"%.6f"</w:t>
+      </w:r>
+      <w:r>
+        <w:rPr>
+          <w:rStyle w:val="NormalTok"/>
+        </w:rPr>
+        <w:t xml:space="preserve">, euler[i])] for i </w:t>
+      </w:r>
+      <w:r>
+        <w:rPr>
+          <w:rStyle w:val="KeywordTok"/>
+        </w:rPr>
+        <w:t xml:space="preserve">in</w:t>
+      </w:r>
+      <w:r>
+        <w:rPr>
+          <w:rStyle w:val="NormalTok"/>
+        </w:rPr>
+        <w:t xml:space="preserve"> </w:t>
+      </w:r>
+      <w:r>
+        <w:rPr>
+          <w:rStyle w:val="FunctionTok"/>
+        </w:rPr>
+        <w:t xml:space="preserve">eachindex</w:t>
+      </w:r>
+      <w:r>
+        <w:rPr>
+          <w:rStyle w:val="NormalTok"/>
+        </w:rPr>
+        <w:t xml:space="preserve">(time)]</w:t>
+      </w:r>
+      <w:r>
+        <w:br/>
+      </w:r>
+      <w:r>
+        <w:rPr>
+          <w:rStyle w:val="FunctionTok"/>
+        </w:rPr>
+        <w:t xml:space="preserve">write_csv</w:t>
+      </w:r>
+      <w:r>
+        <w:rPr>
+          <w:rStyle w:val="NormalTok"/>
+        </w:rPr>
+        <w:t xml:space="preserve">(</w:t>
+      </w:r>
+      <w:r>
+        <w:rPr>
+          <w:rStyle w:val="FunctionTok"/>
+        </w:rPr>
+        <w:t xml:space="preserve">joinpath</w:t>
+      </w:r>
+      <w:r>
+        <w:rPr>
+          <w:rStyle w:val="NormalTok"/>
+        </w:rPr>
+        <w:t xml:space="preserve">(results_dir, </w:t>
+      </w:r>
+      <w:r>
+        <w:rPr>
+          <w:rStyle w:val="StringTok"/>
+        </w:rPr>
+        <w:t xml:space="preserve">"growth_main.csv"</w:t>
+      </w:r>
+      <w:r>
+        <w:rPr>
+          <w:rStyle w:val="NormalTok"/>
+        </w:rPr>
+        <w:t xml:space="preserve">), [</w:t>
+      </w:r>
+      <w:r>
+        <w:rPr>
+          <w:rStyle w:val="StringTok"/>
+        </w:rPr>
+        <w:t xml:space="preserve">"time"</w:t>
+      </w:r>
+      <w:r>
+        <w:rPr>
+          <w:rStyle w:val="NormalTok"/>
+        </w:rPr>
+        <w:t xml:space="preserve">, </w:t>
+      </w:r>
+      <w:r>
+        <w:rPr>
+          <w:rStyle w:val="StringTok"/>
+        </w:rPr>
+        <w:t xml:space="preserve">"analytic"</w:t>
+      </w:r>
+      <w:r>
+        <w:rPr>
+          <w:rStyle w:val="NormalTok"/>
+        </w:rPr>
+        <w:t xml:space="preserve">, </w:t>
+      </w:r>
+      <w:r>
+        <w:rPr>
+          <w:rStyle w:val="StringTok"/>
+        </w:rPr>
+        <w:t xml:space="preserve">"euler"</w:t>
+      </w:r>
+      <w:r>
+        <w:rPr>
+          <w:rStyle w:val="NormalTok"/>
+        </w:rPr>
+        <w:t xml:space="preserve">], rows)</w:t>
+      </w:r>
+      <w:r>
+        <w:br/>
+      </w:r>
+      <w:r>
+        <w:br/>
+      </w:r>
+      <w:r>
+        <w:rPr>
+          <w:rStyle w:val="NormalTok"/>
+        </w:rPr>
+        <w:t xml:space="preserve">alpha_values </w:t>
+      </w:r>
+      <w:r>
+        <w:rPr>
+          <w:rStyle w:val="OperatorTok"/>
+        </w:rPr>
+        <w:t xml:space="preserve">=</w:t>
+      </w:r>
+      <w:r>
+        <w:rPr>
+          <w:rStyle w:val="NormalTok"/>
+        </w:rPr>
+        <w:t xml:space="preserve"> [</w:t>
+      </w:r>
+      <w:r>
+        <w:rPr>
+          <w:rStyle w:val="FloatTok"/>
+        </w:rPr>
+        <w:t xml:space="preserve">0.15</w:t>
+      </w:r>
+      <w:r>
+        <w:rPr>
+          <w:rStyle w:val="NormalTok"/>
+        </w:rPr>
+        <w:t xml:space="preserve">, </w:t>
+      </w:r>
+      <w:r>
+        <w:rPr>
+          <w:rStyle w:val="FloatTok"/>
+        </w:rPr>
+        <w:t xml:space="preserve">0.25</w:t>
+      </w:r>
+      <w:r>
+        <w:rPr>
+          <w:rStyle w:val="NormalTok"/>
+        </w:rPr>
+        <w:t xml:space="preserve">, </w:t>
+      </w:r>
+      <w:r>
+        <w:rPr>
+          <w:rStyle w:val="FloatTok"/>
+        </w:rPr>
+        <w:t xml:space="preserve">0.35</w:t>
+      </w:r>
+      <w:r>
+        <w:rPr>
+          <w:rStyle w:val="NormalTok"/>
+        </w:rPr>
+        <w:t xml:space="preserve">, </w:t>
+      </w:r>
+      <w:r>
+        <w:rPr>
+          <w:rStyle w:val="FloatTok"/>
+        </w:rPr>
+        <w:t xml:space="preserve">0.45</w:t>
+      </w:r>
+      <w:r>
+        <w:rPr>
+          <w:rStyle w:val="NormalTok"/>
+        </w:rPr>
+        <w:t xml:space="preserve">]</w:t>
+      </w:r>
+      <w:r>
+        <w:br/>
+      </w:r>
+      <w:r>
+        <w:rPr>
+          <w:rStyle w:val="NormalTok"/>
+        </w:rPr>
+        <w:t xml:space="preserve">sweep_rows </w:t>
+      </w:r>
+      <w:r>
+        <w:rPr>
+          <w:rStyle w:val="OperatorTok"/>
+        </w:rPr>
+        <w:t xml:space="preserve">=</w:t>
+      </w:r>
+      <w:r>
+        <w:rPr>
+          <w:rStyle w:val="NormalTok"/>
+        </w:rPr>
+        <w:t xml:space="preserve"> </w:t>
+      </w:r>
+      <w:r>
+        <w:rPr>
+          <w:rStyle w:val="FunctionTok"/>
+        </w:rPr>
+        <w:t xml:space="preserve">Vector</w:t>
+      </w:r>
+      <w:r>
+        <w:rPr>
+          <w:rStyle w:val="DataTypeTok"/>
+        </w:rPr>
+        <w:t xml:space="preserve">{Vector{String}}</w:t>
+      </w:r>
+      <w:r>
+        <w:rPr>
+          <w:rStyle w:val="NormalTok"/>
+        </w:rPr>
+        <w:t xml:space="preserve">()</w:t>
+      </w:r>
+      <w:r>
+        <w:br/>
+      </w:r>
+      <w:r>
+        <w:rPr>
+          <w:rStyle w:val="ControlFlowTok"/>
+        </w:rPr>
+        <w:t xml:space="preserve">for</w:t>
+      </w:r>
+      <w:r>
+        <w:rPr>
+          <w:rStyle w:val="NormalTok"/>
+        </w:rPr>
+        <w:t xml:space="preserve"> a </w:t>
+      </w:r>
+      <w:r>
+        <w:rPr>
+          <w:rStyle w:val="KeywordTok"/>
+        </w:rPr>
+        <w:t xml:space="preserve">in</w:t>
+      </w:r>
+      <w:r>
+        <w:rPr>
+          <w:rStyle w:val="NormalTok"/>
+        </w:rPr>
+        <w:t xml:space="preserve"> alpha_values</w:t>
+      </w:r>
+      <w:r>
+        <w:br/>
+      </w:r>
+      <w:r>
+        <w:rPr>
+          <w:rStyle w:val="NormalTok"/>
+        </w:rPr>
+        <w:t xml:space="preserve">    </w:t>
+      </w:r>
+      <w:r>
+        <w:rPr>
+          <w:rStyle w:val="ControlFlowTok"/>
+        </w:rPr>
+        <w:t xml:space="preserve">for</w:t>
+      </w:r>
+      <w:r>
+        <w:rPr>
+          <w:rStyle w:val="NormalTok"/>
+        </w:rPr>
+        <w:t xml:space="preserve"> t </w:t>
+      </w:r>
+      <w:r>
+        <w:rPr>
+          <w:rStyle w:val="KeywordTok"/>
+        </w:rPr>
+        <w:t xml:space="preserve">in</w:t>
+      </w:r>
+      <w:r>
+        <w:rPr>
+          <w:rStyle w:val="NormalTok"/>
+        </w:rPr>
+        <w:t xml:space="preserve"> time</w:t>
+      </w:r>
+      <w:r>
+        <w:br/>
+      </w:r>
+      <w:r>
+        <w:rPr>
+          <w:rStyle w:val="NormalTok"/>
+        </w:rPr>
+        <w:t xml:space="preserve">        </w:t>
+      </w:r>
+      <w:r>
+        <w:rPr>
+          <w:rStyle w:val="FunctionTok"/>
+        </w:rPr>
+        <w:t xml:space="preserve">push!</w:t>
+      </w:r>
+      <w:r>
+        <w:rPr>
+          <w:rStyle w:val="NormalTok"/>
+        </w:rPr>
+        <w:t xml:space="preserve">(sweep_rows, [</w:t>
+      </w:r>
+      <w:r>
+        <w:rPr>
+          <w:rStyle w:val="PreprocessorTok"/>
+        </w:rPr>
+        <w:t xml:space="preserve">@sprintf</w:t>
+      </w:r>
+      <w:r>
+        <w:rPr>
+          <w:rStyle w:val="NormalTok"/>
+        </w:rPr>
+        <w:t xml:space="preserve">(</w:t>
+      </w:r>
+      <w:r>
+        <w:rPr>
+          <w:rStyle w:val="StringTok"/>
+        </w:rPr>
+        <w:t xml:space="preserve">"%.2f"</w:t>
+      </w:r>
+      <w:r>
+        <w:rPr>
+          <w:rStyle w:val="NormalTok"/>
+        </w:rPr>
+        <w:t xml:space="preserve">, a), </w:t>
+      </w:r>
+      <w:r>
+        <w:rPr>
+          <w:rStyle w:val="PreprocessorTok"/>
+        </w:rPr>
+        <w:t xml:space="preserve">@sprintf</w:t>
+      </w:r>
+      <w:r>
+        <w:rPr>
+          <w:rStyle w:val="NormalTok"/>
+        </w:rPr>
+        <w:t xml:space="preserve">(</w:t>
+      </w:r>
+      <w:r>
+        <w:rPr>
+          <w:rStyle w:val="StringTok"/>
+        </w:rPr>
+        <w:t xml:space="preserve">"%.3f"</w:t>
+      </w:r>
+      <w:r>
+        <w:rPr>
+          <w:rStyle w:val="NormalTok"/>
+        </w:rPr>
+        <w:t xml:space="preserve">, t), </w:t>
+      </w:r>
+      <w:r>
+        <w:rPr>
+          <w:rStyle w:val="PreprocessorTok"/>
+        </w:rPr>
+        <w:t xml:space="preserve">@sprintf</w:t>
+      </w:r>
+      <w:r>
+        <w:rPr>
+          <w:rStyle w:val="NormalTok"/>
+        </w:rPr>
+        <w:t xml:space="preserve">(</w:t>
+      </w:r>
+      <w:r>
+        <w:rPr>
+          <w:rStyle w:val="StringTok"/>
+        </w:rPr>
+        <w:t xml:space="preserve">"%.6f"</w:t>
+      </w:r>
+      <w:r>
+        <w:rPr>
+          <w:rStyle w:val="NormalTok"/>
+        </w:rPr>
+        <w:t xml:space="preserve">, u0 </w:t>
+      </w:r>
+      <w:r>
+        <w:rPr>
+          <w:rStyle w:val="OperatorTok"/>
+        </w:rPr>
+        <w:t xml:space="preserve">*</w:t>
+      </w:r>
+      <w:r>
+        <w:rPr>
+          <w:rStyle w:val="NormalTok"/>
+        </w:rPr>
+        <w:t xml:space="preserve"> </w:t>
+      </w:r>
+      <w:r>
+        <w:rPr>
+          <w:rStyle w:val="FunctionTok"/>
+        </w:rPr>
+        <w:t xml:space="preserve">exp</w:t>
+      </w:r>
+      <w:r>
+        <w:rPr>
+          <w:rStyle w:val="NormalTok"/>
+        </w:rPr>
+        <w:t xml:space="preserve">(a </w:t>
+      </w:r>
+      <w:r>
+        <w:rPr>
+          <w:rStyle w:val="OperatorTok"/>
+        </w:rPr>
+        <w:t xml:space="preserve">*</w:t>
+      </w:r>
+      <w:r>
+        <w:rPr>
+          <w:rStyle w:val="NormalTok"/>
+        </w:rPr>
+        <w:t xml:space="preserve"> t))])</w:t>
+      </w:r>
+      <w:r>
+        <w:br/>
+      </w:r>
+      <w:r>
+        <w:rPr>
+          <w:rStyle w:val="NormalTok"/>
+        </w:rPr>
+        <w:t xml:space="preserve">    </w:t>
+      </w:r>
+      <w:r>
+        <w:rPr>
+          <w:rStyle w:val="ControlFlowTok"/>
+        </w:rPr>
+        <w:t xml:space="preserve">end</w:t>
+      </w:r>
+      <w:r>
+        <w:br/>
+      </w:r>
+      <w:r>
+        <w:rPr>
+          <w:rStyle w:val="ControlFlowTok"/>
+        </w:rPr>
+        <w:t xml:space="preserve">end</w:t>
+      </w:r>
+      <w:r>
+        <w:br/>
+      </w:r>
+      <w:r>
+        <w:rPr>
+          <w:rStyle w:val="FunctionTok"/>
+        </w:rPr>
+        <w:t xml:space="preserve">write_csv</w:t>
+      </w:r>
+      <w:r>
+        <w:rPr>
+          <w:rStyle w:val="NormalTok"/>
+        </w:rPr>
+        <w:t xml:space="preserve">(</w:t>
+      </w:r>
+      <w:r>
+        <w:rPr>
+          <w:rStyle w:val="FunctionTok"/>
+        </w:rPr>
+        <w:t xml:space="preserve">joinpath</w:t>
+      </w:r>
+      <w:r>
+        <w:rPr>
+          <w:rStyle w:val="NormalTok"/>
+        </w:rPr>
+        <w:t xml:space="preserve">(results_dir, </w:t>
+      </w:r>
+      <w:r>
+        <w:rPr>
+          <w:rStyle w:val="StringTok"/>
+        </w:rPr>
+        <w:t xml:space="preserve">"growth_sweep.csv"</w:t>
+      </w:r>
+      <w:r>
+        <w:rPr>
+          <w:rStyle w:val="NormalTok"/>
+        </w:rPr>
+        <w:t xml:space="preserve">), [</w:t>
+      </w:r>
+      <w:r>
+        <w:rPr>
+          <w:rStyle w:val="StringTok"/>
+        </w:rPr>
+        <w:t xml:space="preserve">"alpha"</w:t>
+      </w:r>
+      <w:r>
+        <w:rPr>
+          <w:rStyle w:val="NormalTok"/>
+        </w:rPr>
+        <w:t xml:space="preserve">, </w:t>
+      </w:r>
+      <w:r>
+        <w:rPr>
+          <w:rStyle w:val="StringTok"/>
+        </w:rPr>
+        <w:t xml:space="preserve">"time"</w:t>
+      </w:r>
+      <w:r>
+        <w:rPr>
+          <w:rStyle w:val="NormalTok"/>
+        </w:rPr>
+        <w:t xml:space="preserve">, </w:t>
+      </w:r>
+      <w:r>
+        <w:rPr>
+          <w:rStyle w:val="StringTok"/>
+        </w:rPr>
+        <w:t xml:space="preserve">"value"</w:t>
+      </w:r>
+      <w:r>
+        <w:rPr>
+          <w:rStyle w:val="NormalTok"/>
+        </w:rPr>
+        <w:t xml:space="preserve">], sweep_rows)</w:t>
+      </w:r>
+      <w:r>
+        <w:br/>
+      </w:r>
+      <w:r>
+        <w:rPr>
+          <w:rStyle w:val="FunctionTok"/>
+        </w:rPr>
+        <w:t xml:space="preserve">println</w:t>
+      </w:r>
+      <w:r>
+        <w:rPr>
+          <w:rStyle w:val="NormalTok"/>
+        </w:rPr>
+        <w:t xml:space="preserve">(</w:t>
+      </w:r>
+      <w:r>
+        <w:rPr>
+          <w:rStyle w:val="StringTok"/>
+        </w:rPr>
+        <w:t xml:space="preserve">"lab01 done"</w:t>
+      </w:r>
+      <w:r>
+        <w:rPr>
+          <w:rStyle w:val="NormalTok"/>
+        </w:rPr>
+        <w:t xml:space="preserve">)</w:t>
+      </w:r>
+    </w:p>
+    <w:bookmarkEnd w:id="25"/>
+    <w:bookmarkStart w:id="26" w:name="список-литературы"/>
+    <w:p>
+      <w:pPr>
+        <w:pStyle w:val="Heading2"/>
+      </w:pPr>
+      <w:r>
+        <w:t xml:space="preserve">Список литературы</w:t>
+      </w:r>
+    </w:p>
+    <w:p>
+      <w:pPr>
+        <w:pStyle w:val="Compact"/>
+        <w:numPr>
+          <w:ilvl w:val="0"/>
+          <w:numId w:val="1006"/>
+        </w:numPr>
+      </w:pPr>
+      <w:r>
         <w:t xml:space="preserve">Thomas Robert Malthus. An Essay on the Principle of Population. J. Johnson, 1798.</w:t>
       </w:r>
     </w:p>
-    <w:bookmarkEnd w:id="21"/>
-    <w:bookmarkEnd w:id="22"/>
+    <w:bookmarkEnd w:id="26"/>
+    <w:bookmarkEnd w:id="27"/>
     <w:sectPr>
       <w:footnotePr>
         <w:numRestart w:val="eachSect"/>
@@ -804,6 +2913,109 @@
       </w:pPr>
     </w:lvl>
   </w:abstractNum>
+  <w:abstractNum w:abstractNumId="991">
+    <w:nsid w:val="0000A991"/>
+    <w:multiLevelType w:val="multilevel"/>
+    <w:lvl w:ilvl="0">
+      <w:numFmt w:val="bullet"/>
+      <w:lvlText w:val=""/>
+      <w:lvlJc w:val="left"/>
+      <w:pPr>
+        <w:ind w:left="720" w:hanging="360"/>
+      </w:pPr>
+      <w:rPr>
+        <w:rFonts w:ascii="Symbol" w:hAnsi="Symbol" w:cs="Symbol" w:hint="default"/>
+      </w:rPr>
+    </w:lvl>
+    <w:lvl w:ilvl="1">
+      <w:numFmt w:val="bullet"/>
+      <w:lvlText w:val="o"/>
+      <w:lvlJc w:val="left"/>
+      <w:pPr>
+        <w:ind w:left="1440" w:hanging="360"/>
+      </w:pPr>
+      <w:rPr>
+        <w:rFonts w:ascii="Courier New" w:hAnsi="Courier New" w:cs="Courier New" w:hint="default"/>
+      </w:rPr>
+    </w:lvl>
+    <w:lvl w:ilvl="2">
+      <w:numFmt w:val="bullet"/>
+      <w:lvlText w:val=""/>
+      <w:lvlJc w:val="left"/>
+      <w:pPr>
+        <w:ind w:left="2160" w:hanging="360"/>
+      </w:pPr>
+      <w:rPr>
+        <w:rFonts w:ascii="Wingdings" w:hAnsi="Wingdings" w:cs="Wingdings" w:hint="default"/>
+      </w:rPr>
+    </w:lvl>
+    <w:lvl w:ilvl="3">
+      <w:numFmt w:val="bullet"/>
+      <w:lvlText w:val=""/>
+      <w:lvlJc w:val="left"/>
+      <w:pPr>
+        <w:ind w:left="2880" w:hanging="360"/>
+      </w:pPr>
+      <w:rPr>
+        <w:rFonts w:ascii="Symbol" w:hAnsi="Symbol" w:cs="Symbol" w:hint="default"/>
+      </w:rPr>
+    </w:lvl>
+    <w:lvl w:ilvl="4">
+      <w:numFmt w:val="bullet"/>
+      <w:lvlText w:val="o"/>
+      <w:lvlJc w:val="left"/>
+      <w:pPr>
+        <w:ind w:left="3600" w:hanging="360"/>
+      </w:pPr>
+      <w:rPr>
+        <w:rFonts w:ascii="Courier New" w:hAnsi="Courier New" w:cs="Courier New" w:hint="default"/>
+      </w:rPr>
+    </w:lvl>
+    <w:lvl w:ilvl="5">
+      <w:numFmt w:val="bullet"/>
+      <w:lvlText w:val=""/>
+      <w:lvlJc w:val="left"/>
+      <w:pPr>
+        <w:ind w:left="4320" w:hanging="360"/>
+      </w:pPr>
+      <w:rPr>
+        <w:rFonts w:ascii="Wingdings" w:hAnsi="Wingdings" w:cs="Wingdings" w:hint="default"/>
+      </w:rPr>
+    </w:lvl>
+    <w:lvl w:ilvl="6">
+      <w:numFmt w:val="bullet"/>
+      <w:lvlText w:val=""/>
+      <w:lvlJc w:val="left"/>
+      <w:pPr>
+        <w:ind w:left="5040" w:hanging="360"/>
+      </w:pPr>
+      <w:rPr>
+        <w:rFonts w:ascii="Symbol" w:hAnsi="Symbol" w:cs="Symbol" w:hint="default"/>
+      </w:rPr>
+    </w:lvl>
+    <w:lvl w:ilvl="7">
+      <w:numFmt w:val="bullet"/>
+      <w:lvlText w:val="o"/>
+      <w:lvlJc w:val="left"/>
+      <w:pPr>
+        <w:ind w:left="5760" w:hanging="360"/>
+      </w:pPr>
+      <w:rPr>
+        <w:rFonts w:ascii="Courier New" w:hAnsi="Courier New" w:cs="Courier New" w:hint="default"/>
+      </w:rPr>
+    </w:lvl>
+    <w:lvl w:ilvl="8">
+      <w:numFmt w:val="bullet"/>
+      <w:lvlText w:val=""/>
+      <w:lvlJc w:val="left"/>
+      <w:pPr>
+        <w:ind w:left="6480" w:hanging="360"/>
+      </w:pPr>
+      <w:rPr>
+        <w:rFonts w:ascii="Wingdings" w:hAnsi="Wingdings" w:cs="Wingdings" w:hint="default"/>
+      </w:rPr>
+    </w:lvl>
+  </w:abstractNum>
   <w:abstractNum w:abstractNumId="99411">
     <w:nsid w:val="00A99411"/>
     <w:multiLevelType w:val="multilevel"/>
@@ -893,6 +3105,12 @@
     <w:abstractNumId w:val="990"/>
   </w:num>
   <w:num w:numId="1001">
+    <w:abstractNumId w:val="991"/>
+  </w:num>
+  <w:num w:numId="1002">
+    <w:abstractNumId w:val="991"/>
+  </w:num>
+  <w:num w:numId="1003">
     <w:abstractNumId w:val="99411"/>
     <w:lvlOverride w:ilvl="0">
       <w:startOverride w:val="1"/>
@@ -922,7 +3140,40 @@
       <w:startOverride w:val="1"/>
     </w:lvlOverride>
   </w:num>
-  <w:num w:numId="1002">
+  <w:num w:numId="1004">
+    <w:abstractNumId w:val="991"/>
+  </w:num>
+  <w:num w:numId="1005">
+    <w:abstractNumId w:val="99411"/>
+    <w:lvlOverride w:ilvl="0">
+      <w:startOverride w:val="1"/>
+    </w:lvlOverride>
+    <w:lvlOverride w:ilvl="1">
+      <w:startOverride w:val="1"/>
+    </w:lvlOverride>
+    <w:lvlOverride w:ilvl="2">
+      <w:startOverride w:val="1"/>
+    </w:lvlOverride>
+    <w:lvlOverride w:ilvl="3">
+      <w:startOverride w:val="1"/>
+    </w:lvlOverride>
+    <w:lvlOverride w:ilvl="4">
+      <w:startOverride w:val="1"/>
+    </w:lvlOverride>
+    <w:lvlOverride w:ilvl="5">
+      <w:startOverride w:val="1"/>
+    </w:lvlOverride>
+    <w:lvlOverride w:ilvl="6">
+      <w:startOverride w:val="1"/>
+    </w:lvlOverride>
+    <w:lvlOverride w:ilvl="7">
+      <w:startOverride w:val="1"/>
+    </w:lvlOverride>
+    <w:lvlOverride w:ilvl="8">
+      <w:startOverride w:val="1"/>
+    </w:lvlOverride>
+  </w:num>
+  <w:num w:numId="1006">
     <w:abstractNumId w:val="99411"/>
     <w:lvlOverride w:ilvl="0">
       <w:startOverride w:val="1"/>

</xml_diff>